<commit_message>
feat: remove auth, add guest session onboarding UI
</commit_message>
<xml_diff>
--- a/docs/智能体人设设定.docx
+++ b/docs/智能体人设设定.docx
@@ -2313,758 +2313,6 @@
         </w:rPr>
         <w:t>，既适合普通用户做轻量陪伴，也能满足深度用户想要“专属私人AI”的需求。</w:t>
       </w:r>
-    </w:p>
-    <w:p>
-      <w:pPr>
-        <w:pStyle w:val="5"/>
-        <w:spacing w:line="240" w:lineRule="auto"/>
-      </w:pPr>
-    </w:p>
-    <w:p>
-      <w:pPr>
-        <w:pStyle w:val="8"/>
-        <w:spacing w:line="240" w:lineRule="auto"/>
-      </w:pPr>
-      <w:r>
-        <w:rPr>
-          <w:rtl w:val="0"/>
-        </w:rPr>
-        <w:t>四、主要调研的竞品（国外character.ai，国内猫箱/星野）</w:t>
-      </w:r>
-    </w:p>
-    <w:p>
-      <w:pPr>
-        <w:pStyle w:val="5"/>
-        <w:spacing w:line="240" w:lineRule="auto"/>
-      </w:pPr>
-      <w:r>
-        <w:rPr>
-          <w:b/>
-          <w:sz w:val="28"/>
-          <w:szCs w:val="28"/>
-          <w:highlight w:val="lightGray"/>
-          <w:rtl w:val="0"/>
-        </w:rPr>
-        <w:t>1，猫箱</w:t>
-      </w:r>
-    </w:p>
-    <w:p>
-      <w:pPr>
-        <w:pStyle w:val="5"/>
-        <w:spacing w:line="240" w:lineRule="auto"/>
-      </w:pPr>
-      <w:r>
-        <w:rPr>
-          <w:rtl w:val="0"/>
-        </w:rPr>
-        <w:t>1、可直选择模板——已经设置好的直接选择一些剧情（穿越、死对头说爱我、你是系统）或者自定义</w:t>
-      </w:r>
-    </w:p>
-    <w:p>
-      <w:pPr>
-        <w:pStyle w:val="5"/>
-        <w:spacing w:line="240" w:lineRule="auto"/>
-      </w:pPr>
-      <w:r>
-        <w:rPr>
-          <w:rtl w:val="0"/>
-        </w:rPr>
-        <w:t>2、捏形象</w:t>
-      </w:r>
-    </w:p>
-    <w:p>
-      <w:pPr>
-        <w:pStyle w:val="5"/>
-        <w:spacing w:line="240" w:lineRule="auto"/>
-      </w:pPr>
-      <w:r>
-        <w:rPr>
-          <w:rtl w:val="0"/>
-        </w:rPr>
-        <w:t>①自行文字输入形象——如性别外貌、面部表情、肤色服饰等</w:t>
-      </w:r>
-    </w:p>
-    <w:p>
-      <w:pPr>
-        <w:pStyle w:val="5"/>
-        <w:spacing w:line="240" w:lineRule="auto"/>
-      </w:pPr>
-      <w:r>
-        <w:rPr>
-          <w:rtl w:val="0"/>
-        </w:rPr>
-        <w:t>②上传参考图</w:t>
-      </w:r>
-    </w:p>
-    <w:p>
-      <w:pPr>
-        <w:pStyle w:val="5"/>
-        <w:spacing w:line="240" w:lineRule="auto"/>
-      </w:pPr>
-      <w:r>
-        <w:rPr>
-          <w:rtl w:val="0"/>
-        </w:rPr>
-        <w:t>③选择风格——动漫、通用、神话等</w:t>
-      </w:r>
-    </w:p>
-    <w:p>
-      <w:pPr>
-        <w:pStyle w:val="5"/>
-        <w:spacing w:line="240" w:lineRule="auto"/>
-      </w:pPr>
-      <w:r>
-        <w:rPr>
-          <w:rtl w:val="0"/>
-        </w:rPr>
-        <w:t>3、角色</w:t>
-      </w:r>
-    </w:p>
-    <w:p>
-      <w:pPr>
-        <w:pStyle w:val="5"/>
-        <w:spacing w:line="240" w:lineRule="auto"/>
-      </w:pPr>
-      <w:r>
-        <w:rPr>
-          <w:rtl w:val="0"/>
-        </w:rPr>
-        <w:t>①用户输入想创建角色的性格、背景经历、与用户的关系等（AI助手可帮助创建）</w:t>
-      </w:r>
-    </w:p>
-    <w:p>
-      <w:pPr>
-        <w:pStyle w:val="5"/>
-        <w:spacing w:line="240" w:lineRule="auto"/>
-      </w:pPr>
-      <w:r>
-        <w:rPr>
-          <w:rtl w:val="0"/>
-        </w:rPr>
-        <w:t>②也可选择模板</w:t>
-      </w:r>
-    </w:p>
-    <w:p>
-      <w:pPr>
-        <w:pStyle w:val="5"/>
-        <w:spacing w:line="240" w:lineRule="auto"/>
-      </w:pPr>
-      <w:r>
-        <w:rPr>
-          <w:rtl w:val="0"/>
-        </w:rPr>
-        <w:t>每个模板下需要输入特定的信息，如选择夸夸模板则需要填写想被夸得部分如长得美、能力强等。</w:t>
-      </w:r>
-    </w:p>
-    <w:p>
-      <w:pPr>
-        <w:pStyle w:val="5"/>
-        <w:spacing w:line="240" w:lineRule="auto"/>
-      </w:pPr>
-      <w:r>
-        <w:rPr>
-          <w:rtl w:val="0"/>
-        </w:rPr>
-        <w:t>4、故事</w:t>
-      </w:r>
-    </w:p>
-    <w:p>
-      <w:pPr>
-        <w:pStyle w:val="5"/>
-        <w:spacing w:line="240" w:lineRule="auto"/>
-      </w:pPr>
-      <w:r>
-        <w:rPr>
-          <w:rtl w:val="0"/>
-        </w:rPr>
-        <w:t>①用户输入想构建得世界观，如主题背景、人物关系、玩法规则等。</w:t>
-      </w:r>
-    </w:p>
-    <w:p>
-      <w:pPr>
-        <w:pStyle w:val="5"/>
-        <w:spacing w:line="240" w:lineRule="auto"/>
-      </w:pPr>
-      <w:r>
-        <w:rPr>
-          <w:rtl w:val="0"/>
-        </w:rPr>
-        <w:t>②或可选择模板</w:t>
-      </w:r>
-    </w:p>
-    <w:p>
-      <w:pPr>
-        <w:pStyle w:val="5"/>
-        <w:spacing w:line="240" w:lineRule="auto"/>
-      </w:pPr>
-      <w:r>
-        <w:rPr>
-          <w:rtl w:val="0"/>
-        </w:rPr>
-        <w:drawing>
-          <wp:inline distT="0" distB="0" distL="114300" distR="114300">
-            <wp:extent cx="2203450" cy="4898390"/>
-            <wp:effectExtent l="0" t="0" r="6350" b="3810"/>
-            <wp:docPr id="332" name="Drawing 1"/>
-            <wp:cNvGraphicFramePr/>
-            <a:graphic xmlns:a="http://schemas.openxmlformats.org/drawingml/2006/main">
-              <a:graphicData uri="http://schemas.openxmlformats.org/drawingml/2006/picture">
-                <pic:pic xmlns:pic="http://schemas.openxmlformats.org/drawingml/2006/picture">
-                  <pic:nvPicPr>
-                    <pic:cNvPr id="332" name="Drawing 1"/>
-                    <pic:cNvPicPr/>
-                  </pic:nvPicPr>
-                  <pic:blipFill>
-                    <a:blip r:embed="rId4"/>
-                    <a:stretch>
-                      <a:fillRect/>
-                    </a:stretch>
-                  </pic:blipFill>
-                  <pic:spPr>
-                    <a:xfrm>
-                      <a:off x="0" y="0"/>
-                      <a:ext cx="2203831" cy="4899007"/>
-                    </a:xfrm>
-                    <a:prstGeom prst="rect">
-                      <a:avLst/>
-                    </a:prstGeom>
-                  </pic:spPr>
-                </pic:pic>
-              </a:graphicData>
-            </a:graphic>
-          </wp:inline>
-        </w:drawing>
-      </w:r>
-    </w:p>
-    <w:p>
-      <w:pPr>
-        <w:pStyle w:val="5"/>
-        <w:spacing w:line="240" w:lineRule="auto"/>
-      </w:pPr>
-    </w:p>
-    <w:p>
-      <w:pPr>
-        <w:pStyle w:val="5"/>
-        <w:spacing w:line="240" w:lineRule="auto"/>
-      </w:pPr>
-    </w:p>
-    <w:p>
-      <w:pPr>
-        <w:pStyle w:val="5"/>
-        <w:spacing w:line="240" w:lineRule="auto"/>
-      </w:pPr>
-      <w:r>
-        <w:rPr>
-          <w:b/>
-          <w:sz w:val="26"/>
-          <w:szCs w:val="26"/>
-          <w:highlight w:val="lightGray"/>
-          <w:rtl w:val="0"/>
-        </w:rPr>
-        <w:t>2，星野</w:t>
-      </w:r>
-    </w:p>
-    <w:p>
-      <w:pPr>
-        <w:pStyle w:val="5"/>
-        <w:spacing w:line="240" w:lineRule="auto"/>
-      </w:pPr>
-      <w:r>
-        <w:rPr>
-          <w:rtl w:val="0"/>
-        </w:rPr>
-        <w:t>1、设定容貌、形象（可上传图片）或者固定模板可选择</w:t>
-      </w:r>
-    </w:p>
-    <w:p>
-      <w:pPr>
-        <w:pStyle w:val="5"/>
-        <w:spacing w:line="240" w:lineRule="auto"/>
-      </w:pPr>
-      <w:r>
-        <w:rPr>
-          <w:rtl w:val="0"/>
-        </w:rPr>
-        <w:t>2、智能体声音</w:t>
-      </w:r>
-    </w:p>
-    <w:p>
-      <w:pPr>
-        <w:pStyle w:val="5"/>
-        <w:spacing w:line="240" w:lineRule="auto"/>
-      </w:pPr>
-      <w:r>
-        <w:rPr>
-          <w:rtl w:val="0"/>
-        </w:rPr>
-        <w:t>①官方音色库/自定义</w:t>
-      </w:r>
-    </w:p>
-    <w:p>
-      <w:pPr>
-        <w:pStyle w:val="5"/>
-        <w:spacing w:line="240" w:lineRule="auto"/>
-      </w:pPr>
-      <w:r>
-        <w:rPr>
-          <w:rtl w:val="0"/>
-        </w:rPr>
-        <w:t>②聊天背景音乐（可选可不选）</w:t>
-      </w:r>
-    </w:p>
-    <w:p>
-      <w:pPr>
-        <w:pStyle w:val="5"/>
-        <w:spacing w:line="240" w:lineRule="auto"/>
-      </w:pPr>
-      <w:r>
-        <w:rPr>
-          <w:rtl w:val="0"/>
-        </w:rPr>
-        <w:t>3、智能体人设</w:t>
-      </w:r>
-    </w:p>
-    <w:p>
-      <w:pPr>
-        <w:pStyle w:val="5"/>
-        <w:spacing w:line="240" w:lineRule="auto"/>
-      </w:pPr>
-      <w:r>
-        <w:rPr>
-          <w:rtl w:val="0"/>
-        </w:rPr>
-        <w:t>①昵称</w:t>
-      </w:r>
-    </w:p>
-    <w:p>
-      <w:pPr>
-        <w:pStyle w:val="5"/>
-        <w:spacing w:line="240" w:lineRule="auto"/>
-      </w:pPr>
-      <w:r>
-        <w:rPr>
-          <w:rtl w:val="0"/>
-        </w:rPr>
-        <w:t>②性别——男/女/暂不透露</w:t>
-      </w:r>
-    </w:p>
-    <w:p>
-      <w:pPr>
-        <w:pStyle w:val="5"/>
-        <w:spacing w:line="240" w:lineRule="auto"/>
-      </w:pPr>
-      <w:r>
-        <w:rPr>
-          <w:rtl w:val="0"/>
-        </w:rPr>
-        <w:t>4、智能体设定（决定回复效果）</w:t>
-      </w:r>
-    </w:p>
-    <w:p>
-      <w:pPr>
-        <w:pStyle w:val="5"/>
-        <w:spacing w:line="240" w:lineRule="auto"/>
-      </w:pPr>
-      <w:r>
-        <w:rPr>
-          <w:rtl w:val="0"/>
-        </w:rPr>
-        <w:t>智能体的人设、性格、身份、背景经历、聊天风格、与用户的关系等。</w:t>
-      </w:r>
-    </w:p>
-    <w:p>
-      <w:pPr>
-        <w:pStyle w:val="5"/>
-        <w:spacing w:line="240" w:lineRule="auto"/>
-      </w:pPr>
-      <w:r>
-        <w:rPr>
-          <w:rtl w:val="0"/>
-        </w:rPr>
-        <w:t>5、对外简介</w:t>
-      </w:r>
-    </w:p>
-    <w:p>
-      <w:pPr>
-        <w:pStyle w:val="5"/>
-        <w:spacing w:line="240" w:lineRule="auto"/>
-      </w:pPr>
-      <w:r>
-        <w:rPr>
-          <w:rtl w:val="0"/>
-        </w:rPr>
-        <w:t>方便其他用户了解智能体的专属信息，如背景、身份、人设与用户的关系等。</w:t>
-      </w:r>
-    </w:p>
-    <w:p>
-      <w:pPr>
-        <w:pStyle w:val="5"/>
-        <w:spacing w:line="240" w:lineRule="auto"/>
-      </w:pPr>
-      <w:r>
-        <w:rPr>
-          <w:rtl w:val="0"/>
-        </w:rPr>
-        <w:t>6、开场白</w:t>
-      </w:r>
-    </w:p>
-    <w:p>
-      <w:pPr>
-        <w:pStyle w:val="5"/>
-        <w:spacing w:line="240" w:lineRule="auto"/>
-      </w:pPr>
-      <w:r>
-        <w:rPr>
-          <w:rtl w:val="0"/>
-        </w:rPr>
-        <w:drawing>
-          <wp:inline distT="0" distB="0" distL="114300" distR="114300">
-            <wp:extent cx="1395095" cy="3101975"/>
-            <wp:effectExtent l="0" t="0" r="1905" b="22225"/>
-            <wp:docPr id="362" name="Drawing 2"/>
-            <wp:cNvGraphicFramePr/>
-            <a:graphic xmlns:a="http://schemas.openxmlformats.org/drawingml/2006/main">
-              <a:graphicData uri="http://schemas.openxmlformats.org/drawingml/2006/picture">
-                <pic:pic xmlns:pic="http://schemas.openxmlformats.org/drawingml/2006/picture">
-                  <pic:nvPicPr>
-                    <pic:cNvPr id="362" name="Drawing 2"/>
-                    <pic:cNvPicPr/>
-                  </pic:nvPicPr>
-                  <pic:blipFill>
-                    <a:blip r:embed="rId5"/>
-                    <a:stretch>
-                      <a:fillRect/>
-                    </a:stretch>
-                  </pic:blipFill>
-                  <pic:spPr>
-                    <a:xfrm>
-                      <a:off x="0" y="0"/>
-                      <a:ext cx="1395476" cy="3102074"/>
-                    </a:xfrm>
-                    <a:prstGeom prst="rect">
-                      <a:avLst/>
-                    </a:prstGeom>
-                  </pic:spPr>
-                </pic:pic>
-              </a:graphicData>
-            </a:graphic>
-          </wp:inline>
-        </w:drawing>
-      </w:r>
-    </w:p>
-    <w:p>
-      <w:pPr>
-        <w:pStyle w:val="5"/>
-        <w:spacing w:line="240" w:lineRule="auto"/>
-      </w:pPr>
-    </w:p>
-    <w:p>
-      <w:pPr>
-        <w:pStyle w:val="5"/>
-        <w:spacing w:line="240" w:lineRule="auto"/>
-      </w:pPr>
-      <w:r>
-        <w:rPr>
-          <w:b/>
-          <w:sz w:val="26"/>
-          <w:szCs w:val="26"/>
-          <w:highlight w:val="lightGray"/>
-          <w:rtl w:val="0"/>
-        </w:rPr>
-        <w:t>3，character.ai</w:t>
-      </w:r>
-    </w:p>
-    <w:p>
-      <w:pPr>
-        <w:pStyle w:val="5"/>
-        <w:spacing w:line="240" w:lineRule="auto"/>
-      </w:pPr>
-      <w:r>
-        <w:rPr>
-          <w:rtl w:val="0"/>
-        </w:rPr>
-        <w:t>进来之后选择自己感兴趣得几个方向，如学习英语、情感支持、自我成长等至少选三个，以这些选择为基础融入到接下来创建的智能体。</w:t>
-      </w:r>
-    </w:p>
-    <w:p>
-      <w:pPr>
-        <w:pStyle w:val="5"/>
-        <w:spacing w:line="240" w:lineRule="auto"/>
-      </w:pPr>
-      <w:r>
-        <w:rPr>
-          <w:rtl w:val="0"/>
-        </w:rPr>
-        <w:t>1、角色</w:t>
-      </w:r>
-    </w:p>
-    <w:p>
-      <w:pPr>
-        <w:pStyle w:val="5"/>
-        <w:spacing w:line="240" w:lineRule="auto"/>
-      </w:pPr>
-      <w:r>
-        <w:rPr>
-          <w:rtl w:val="0"/>
-        </w:rPr>
-        <w:t>①姓名</w:t>
-      </w:r>
-    </w:p>
-    <w:p>
-      <w:pPr>
-        <w:pStyle w:val="5"/>
-        <w:spacing w:line="240" w:lineRule="auto"/>
-      </w:pPr>
-      <w:r>
-        <w:rPr>
-          <w:rtl w:val="0"/>
-        </w:rPr>
-        <w:t>②描述其形象（根据描述的形象可AI生成），也可直接上传图片</w:t>
-      </w:r>
-    </w:p>
-    <w:p>
-      <w:pPr>
-        <w:pStyle w:val="5"/>
-        <w:spacing w:line="240" w:lineRule="auto"/>
-      </w:pPr>
-      <w:r>
-        <w:rPr>
-          <w:rtl w:val="0"/>
-        </w:rPr>
-        <w:t>③选择语音——可选择系统音or自创建</w:t>
-      </w:r>
-    </w:p>
-    <w:p>
-      <w:pPr>
-        <w:pStyle w:val="5"/>
-        <w:spacing w:line="240" w:lineRule="auto"/>
-      </w:pPr>
-      <w:r>
-        <w:rPr>
-          <w:rtl w:val="0"/>
-        </w:rPr>
-        <w:t>④问候语（可选择添加五条问候语，如我一直在等你/今天过得好吗。还可选择新聊天的问候语，用户开始新聊天后看到的第一条消息是基于问候语由AI生成的变体)</w:t>
-      </w:r>
-    </w:p>
-    <w:p>
-      <w:pPr>
-        <w:pStyle w:val="5"/>
-        <w:spacing w:line="240" w:lineRule="auto"/>
-      </w:pPr>
-      <w:r>
-        <w:rPr>
-          <w:rtl w:val="0"/>
-        </w:rPr>
-        <w:t>⑤选择可见性——公开/非公开/私有</w:t>
-      </w:r>
-    </w:p>
-    <w:p>
-      <w:pPr>
-        <w:pStyle w:val="5"/>
-        <w:spacing w:line="240" w:lineRule="auto"/>
-      </w:pPr>
-      <w:r>
-        <w:rPr>
-          <w:rtl w:val="0"/>
-        </w:rPr>
-        <w:t>2、形象</w:t>
-      </w:r>
-    </w:p>
-    <w:p>
-      <w:pPr>
-        <w:pStyle w:val="5"/>
-        <w:spacing w:line="240" w:lineRule="auto"/>
-      </w:pPr>
-      <w:r>
-        <w:rPr>
-          <w:rtl w:val="0"/>
-        </w:rPr>
-        <w:t>角色记住形象信息，改进与用户的对话</w:t>
-      </w:r>
-    </w:p>
-    <w:p>
-      <w:pPr>
-        <w:pStyle w:val="5"/>
-        <w:spacing w:line="240" w:lineRule="auto"/>
-      </w:pPr>
-      <w:r>
-        <w:rPr>
-          <w:rtl w:val="0"/>
-        </w:rPr>
-        <w:t>创建多个形象，在聊天间切换背景信息</w:t>
-      </w:r>
-    </w:p>
-    <w:p>
-      <w:pPr>
-        <w:pStyle w:val="5"/>
-        <w:spacing w:line="240" w:lineRule="auto"/>
-      </w:pPr>
-      <w:r>
-        <w:rPr>
-          <w:rtl w:val="0"/>
-        </w:rPr>
-        <w:drawing>
-          <wp:inline distT="0" distB="0" distL="114300" distR="114300">
-            <wp:extent cx="2067560" cy="4596130"/>
-            <wp:effectExtent l="0" t="0" r="15240" b="1270"/>
-            <wp:docPr id="387" name="Drawing 3"/>
-            <wp:cNvGraphicFramePr/>
-            <a:graphic xmlns:a="http://schemas.openxmlformats.org/drawingml/2006/main">
-              <a:graphicData uri="http://schemas.openxmlformats.org/drawingml/2006/picture">
-                <pic:pic xmlns:pic="http://schemas.openxmlformats.org/drawingml/2006/picture">
-                  <pic:nvPicPr>
-                    <pic:cNvPr id="387" name="Drawing 3"/>
-                    <pic:cNvPicPr/>
-                  </pic:nvPicPr>
-                  <pic:blipFill>
-                    <a:blip r:embed="rId6"/>
-                    <a:stretch>
-                      <a:fillRect/>
-                    </a:stretch>
-                  </pic:blipFill>
-                  <pic:spPr>
-                    <a:xfrm>
-                      <a:off x="0" y="0"/>
-                      <a:ext cx="2067687" cy="4596366"/>
-                    </a:xfrm>
-                    <a:prstGeom prst="rect">
-                      <a:avLst/>
-                    </a:prstGeom>
-                  </pic:spPr>
-                </pic:pic>
-              </a:graphicData>
-            </a:graphic>
-          </wp:inline>
-        </w:drawing>
-      </w:r>
-    </w:p>
-    <w:p>
-      <w:pPr>
-        <w:pStyle w:val="5"/>
-        <w:spacing w:line="240" w:lineRule="auto"/>
-      </w:pPr>
-      <w:r>
-        <w:rPr>
-          <w:rtl w:val="0"/>
-        </w:rPr>
-        <w:t>3、场景</w:t>
-      </w:r>
-    </w:p>
-    <w:p>
-      <w:pPr>
-        <w:pStyle w:val="5"/>
-        <w:spacing w:line="240" w:lineRule="auto"/>
-      </w:pPr>
-      <w:r>
-        <w:rPr>
-          <w:rtl w:val="0"/>
-        </w:rPr>
-        <w:t>从网页来访问与标记场景。手机APP有创建好的场景可选择对话。</w:t>
-      </w:r>
-    </w:p>
-    <w:p>
-      <w:pPr>
-        <w:pStyle w:val="5"/>
-        <w:spacing w:line="240" w:lineRule="auto"/>
-      </w:pPr>
-      <w:r>
-        <w:rPr>
-          <w:rtl w:val="0"/>
-        </w:rPr>
-        <w:t>4、群聊</w:t>
-      </w:r>
-    </w:p>
-    <w:p>
-      <w:pPr>
-        <w:pStyle w:val="5"/>
-        <w:spacing w:line="240" w:lineRule="auto"/>
-      </w:pPr>
-      <w:r>
-        <w:rPr>
-          <w:rtl w:val="0"/>
-        </w:rPr>
-        <w:t>将创建好的角色添加在一个群里进行对话。可选择特定场景</w:t>
-      </w:r>
-    </w:p>
-    <w:p>
-      <w:pPr>
-        <w:pStyle w:val="5"/>
-        <w:spacing w:line="240" w:lineRule="auto"/>
-      </w:pPr>
-      <w:r>
-        <w:rPr>
-          <w:rtl w:val="0"/>
-        </w:rPr>
-        <w:t>5、视频</w:t>
-      </w:r>
-    </w:p>
-    <w:p>
-      <w:pPr>
-        <w:pStyle w:val="5"/>
-        <w:spacing w:line="240" w:lineRule="auto"/>
-      </w:pPr>
-      <w:r>
-        <w:rPr>
-          <w:rtl w:val="0"/>
-        </w:rPr>
-        <w:t>6、语音</w:t>
-      </w:r>
-    </w:p>
-    <w:p>
-      <w:pPr>
-        <w:pStyle w:val="5"/>
-        <w:spacing w:line="240" w:lineRule="auto"/>
-      </w:pPr>
-    </w:p>
-    <w:p>
-      <w:pPr>
-        <w:pStyle w:val="5"/>
-        <w:spacing w:line="240" w:lineRule="auto"/>
-      </w:pPr>
-      <w:r>
-        <w:rPr>
-          <w:rtl w:val="0"/>
-        </w:rPr>
-        <w:drawing>
-          <wp:inline distT="0" distB="0" distL="114300" distR="114300">
-            <wp:extent cx="1803400" cy="4009390"/>
-            <wp:effectExtent l="0" t="0" r="0" b="3810"/>
-            <wp:docPr id="402" name="Drawing 4"/>
-            <wp:cNvGraphicFramePr/>
-            <a:graphic xmlns:a="http://schemas.openxmlformats.org/drawingml/2006/main">
-              <a:graphicData uri="http://schemas.openxmlformats.org/drawingml/2006/picture">
-                <pic:pic xmlns:pic="http://schemas.openxmlformats.org/drawingml/2006/picture">
-                  <pic:nvPicPr>
-                    <pic:cNvPr id="402" name="Drawing 4"/>
-                    <pic:cNvPicPr/>
-                  </pic:nvPicPr>
-                  <pic:blipFill>
-                    <a:blip r:embed="rId7"/>
-                    <a:stretch>
-                      <a:fillRect/>
-                    </a:stretch>
-                  </pic:blipFill>
-                  <pic:spPr>
-                    <a:xfrm>
-                      <a:off x="0" y="0"/>
-                      <a:ext cx="1803908" cy="4009998"/>
-                    </a:xfrm>
-                    <a:prstGeom prst="rect">
-                      <a:avLst/>
-                    </a:prstGeom>
-                  </pic:spPr>
-                </pic:pic>
-              </a:graphicData>
-            </a:graphic>
-          </wp:inline>
-        </w:drawing>
-      </w:r>
-    </w:p>
-    <w:p>
-      <w:pPr>
-        <w:pStyle w:val="5"/>
-        <w:spacing w:line="240" w:lineRule="auto"/>
-      </w:pPr>
     </w:p>
     <w:p>
       <w:pPr>
@@ -3504,45 +2752,7 @@
           <w:szCs w:val="30"/>
           <w:shd w:val="clear" w:fill="FFFFFF"/>
         </w:rPr>
-        <w:t>二、差异化竞争优势建议 对比猫箱、星野、Character.ai，你的核心突破点应该在：</w:t>
-      </w:r>
-    </w:p>
-    <w:p>
-      <w:pPr>
-        <w:keepNext w:val="0"/>
-        <w:keepLines w:val="0"/>
-        <w:widowControl/>
-        <w:numPr>
-          <w:ilvl w:val="0"/>
-          <w:numId w:val="6"/>
-        </w:numPr>
-        <w:suppressLineNumbers w:val="0"/>
-        <w:pBdr>
-          <w:top w:val="single" w:color="E5E7EB" w:sz="2" w:space="0"/>
-          <w:left w:val="single" w:color="E5E7EB" w:sz="2" w:space="0"/>
-          <w:bottom w:val="single" w:color="E5E7EB" w:sz="2" w:space="0"/>
-          <w:right w:val="single" w:color="E5E7EB" w:sz="2" w:space="0"/>
-        </w:pBdr>
-        <w:spacing w:before="0" w:beforeAutospacing="1" w:after="0" w:afterAutospacing="1"/>
-        <w:ind w:left="720" w:hanging="360"/>
-        <w:rPr>
-          <w:color w:val="1A1D23"/>
-        </w:rPr>
-      </w:pPr>
-      <w:r>
-        <w:rPr>
-          <w:rFonts w:hint="default" w:ascii="sans-serif" w:hAnsi="sans-serif" w:eastAsia="sans-serif" w:cs="sans-serif"/>
-          <w:i w:val="0"/>
-          <w:iCs w:val="0"/>
-          <w:caps w:val="0"/>
-          <w:color w:val="1A1D23"/>
-          <w:spacing w:val="0"/>
-          <w:sz w:val="30"/>
-          <w:szCs w:val="30"/>
-          <w:bdr w:val="single" w:color="E5E7EB" w:sz="2" w:space="0"/>
-          <w:shd w:val="clear" w:fill="FFFFFF"/>
-        </w:rPr>
-        <w:t>情绪智能 × 长期记忆 = 真实陪伴感 竞品短板：</w:t>
+        <w:t>"情绪分级响应"：</w:t>
       </w:r>
     </w:p>
     <w:p>
@@ -3570,21 +2780,22 @@
           <w:spacing w:val="0"/>
           <w:sz w:val="30"/>
           <w:szCs w:val="30"/>
-        </w:rPr>
-      </w:pPr>
-      <w:r>
-        <w:rPr>
-          <w:rFonts w:hint="default" w:ascii="sans-serif" w:hAnsi="sans-serif" w:eastAsia="sans-serif" w:cs="sans-serif"/>
-          <w:i w:val="0"/>
-          <w:iCs w:val="0"/>
-          <w:caps w:val="0"/>
-          <w:color w:val="1A1D23"/>
-          <w:spacing w:val="0"/>
-          <w:sz w:val="30"/>
-          <w:szCs w:val="30"/>
           <w:shd w:val="clear" w:fill="FFFFFF"/>
         </w:rPr>
-        <w:t>猫箱/星野：偏重角色扮演娱乐，缺乏真实情感追踪 Character.ai：对话质量高但记忆浅薄，每次像新朋友 你的优势方向：</w:t>
+      </w:pPr>
+      <w:r>
+        <w:rPr>
+          <w:rFonts w:hint="default" w:ascii="sans-serif" w:hAnsi="sans-serif" w:eastAsia="sans-serif" w:cs="sans-serif"/>
+          <w:i w:val="0"/>
+          <w:iCs w:val="0"/>
+          <w:caps w:val="0"/>
+          <w:color w:val="1A1D23"/>
+          <w:spacing w:val="0"/>
+          <w:sz w:val="30"/>
+          <w:szCs w:val="30"/>
+          <w:shd w:val="clear" w:fill="FFFFFF"/>
+        </w:rPr>
+        <w:t xml:space="preserve">轻度情绪 → 轻松陪聊 中度焦虑 → 深度倾听 + CBT技巧 重度风险 → 推荐专业资源（如心理热线） </w:t>
       </w:r>
     </w:p>
     <w:p>
@@ -3626,45 +2837,7 @@
           <w:szCs w:val="30"/>
           <w:shd w:val="clear" w:fill="FFFFFF"/>
         </w:rPr>
-        <w:t>情绪时间轴：记录用户情绪波动（如"最近三周每周三都焦虑"），主动关心 成长陪伴档案：记住用户的考试时间、暗恋对象、家庭矛盾等，像真正的朋友 情绪预警机制：当检测到持续低落情绪时，温和引导专业帮助 实现难点：需要强语义理解模型 + 本地化长期记忆存储（隐私安全）</w:t>
-      </w:r>
-    </w:p>
-    <w:p>
-      <w:pPr>
-        <w:keepNext w:val="0"/>
-        <w:keepLines w:val="0"/>
-        <w:widowControl/>
-        <w:numPr>
-          <w:ilvl w:val="0"/>
-          <w:numId w:val="7"/>
-        </w:numPr>
-        <w:suppressLineNumbers w:val="0"/>
-        <w:pBdr>
-          <w:top w:val="single" w:color="E5E7EB" w:sz="2" w:space="0"/>
-          <w:left w:val="single" w:color="E5E7EB" w:sz="2" w:space="0"/>
-          <w:bottom w:val="single" w:color="E5E7EB" w:sz="2" w:space="0"/>
-          <w:right w:val="single" w:color="E5E7EB" w:sz="2" w:space="0"/>
-        </w:pBdr>
-        <w:spacing w:before="0" w:beforeAutospacing="1" w:after="0" w:afterAutospacing="1"/>
-        <w:ind w:left="720" w:hanging="360"/>
-        <w:rPr>
-          <w:color w:val="1A1D23"/>
-        </w:rPr>
-      </w:pPr>
-      <w:r>
-        <w:rPr>
-          <w:rFonts w:hint="default" w:ascii="sans-serif" w:hAnsi="sans-serif" w:eastAsia="sans-serif" w:cs="sans-serif"/>
-          <w:i w:val="0"/>
-          <w:iCs w:val="0"/>
-          <w:caps w:val="0"/>
-          <w:color w:val="1A1D23"/>
-          <w:spacing w:val="0"/>
-          <w:sz w:val="30"/>
-          <w:szCs w:val="30"/>
-          <w:bdr w:val="single" w:color="E5E7EB" w:sz="2" w:space="0"/>
-          <w:shd w:val="clear" w:fill="FFFFFF"/>
-        </w:rPr>
-        <w:t>边界感设计 = 安全+舒适 **这是你文档里最亮的点！**竞品普遍忽视这个：</w:t>
+        <w:t>防沉迷机制（针对青少年）：</w:t>
       </w:r>
     </w:p>
     <w:p>
@@ -3706,7 +2879,7 @@
           <w:szCs w:val="30"/>
           <w:shd w:val="clear" w:fill="FFFFFF"/>
         </w:rPr>
-        <w:t>你的独特价值：</w:t>
+        <w:t>每日对话时长提醒 鼓励线下社交（如"要不要找朋友出去走走？"）</w:t>
       </w:r>
     </w:p>
     <w:p>
@@ -3734,21 +2907,22 @@
           <w:spacing w:val="0"/>
           <w:sz w:val="30"/>
           <w:szCs w:val="30"/>
-        </w:rPr>
-      </w:pPr>
-      <w:r>
-        <w:rPr>
-          <w:rFonts w:hint="default" w:ascii="sans-serif" w:hAnsi="sans-serif" w:eastAsia="sans-serif" w:cs="sans-serif"/>
-          <w:i w:val="0"/>
-          <w:iCs w:val="0"/>
-          <w:caps w:val="0"/>
-          <w:color w:val="1A1D23"/>
-          <w:spacing w:val="0"/>
-          <w:sz w:val="30"/>
-          <w:szCs w:val="30"/>
           <w:shd w:val="clear" w:fill="FFFFFF"/>
         </w:rPr>
-        <w:t>模块4主动交互边界：避免AI骚扰，让用户掌控节奏 模块5话题边界：不过度情感承诺（避免依赖成瘾），不打探隐私 建议升级：</w:t>
+      </w:pPr>
+      <w:r>
+        <w:rPr>
+          <w:rFonts w:hint="default" w:ascii="sans-serif" w:hAnsi="sans-serif" w:eastAsia="sans-serif" w:cs="sans-serif"/>
+          <w:i w:val="0"/>
+          <w:iCs w:val="0"/>
+          <w:caps w:val="0"/>
+          <w:color w:val="1A1D23"/>
+          <w:spacing w:val="0"/>
+          <w:sz w:val="30"/>
+          <w:szCs w:val="30"/>
+          <w:shd w:val="clear" w:fill="FFFFFF"/>
+        </w:rPr>
+        <w:t xml:space="preserve"> ✅ 模块化设置逻辑清晰：快速设置 → 高级自定义，降低门槛 </w:t>
       </w:r>
     </w:p>
     <w:p>
@@ -3790,7 +2964,45 @@
           <w:szCs w:val="30"/>
           <w:shd w:val="clear" w:fill="FFFFFF"/>
         </w:rPr>
-        <w:t>"情绪分级响应"：</w:t>
+        <w:t>"治愈树洞"角色定位准确：对标青少年需求 记忆与隐私模块：是核心竞争力，必须深度打磨 需要优化的部分 ⚠️</w:t>
+      </w:r>
+    </w:p>
+    <w:p>
+      <w:pPr>
+        <w:keepNext w:val="0"/>
+        <w:keepLines w:val="0"/>
+        <w:widowControl/>
+        <w:numPr>
+          <w:ilvl w:val="0"/>
+          <w:numId w:val="6"/>
+        </w:numPr>
+        <w:suppressLineNumbers w:val="0"/>
+        <w:pBdr>
+          <w:top w:val="single" w:color="E5E7EB" w:sz="2" w:space="0"/>
+          <w:left w:val="single" w:color="E5E7EB" w:sz="2" w:space="0"/>
+          <w:bottom w:val="single" w:color="E5E7EB" w:sz="2" w:space="0"/>
+          <w:right w:val="single" w:color="E5E7EB" w:sz="2" w:space="0"/>
+        </w:pBdr>
+        <w:spacing w:before="0" w:beforeAutospacing="1" w:after="0" w:afterAutospacing="1"/>
+        <w:ind w:left="720" w:hanging="360"/>
+        <w:rPr>
+          <w:color w:val="1A1D23"/>
+        </w:rPr>
+      </w:pPr>
+      <w:r>
+        <w:rPr>
+          <w:rFonts w:hint="default" w:ascii="sans-serif" w:hAnsi="sans-serif" w:eastAsia="sans-serif" w:cs="sans-serif"/>
+          <w:i w:val="0"/>
+          <w:iCs w:val="0"/>
+          <w:caps w:val="0"/>
+          <w:color w:val="1A1D23"/>
+          <w:spacing w:val="0"/>
+          <w:sz w:val="30"/>
+          <w:szCs w:val="30"/>
+          <w:bdr w:val="single" w:color="E5E7EB" w:sz="2" w:space="0"/>
+          <w:shd w:val="clear" w:fill="FFFFFF"/>
+        </w:rPr>
+        <w:t>简化初期选择，降低决策疲劳 问题：你的文档里有太多选项（7大模块），学生用户可能懵 建议：</w:t>
       </w:r>
     </w:p>
     <w:p>
@@ -3818,22 +3030,21 @@
           <w:spacing w:val="0"/>
           <w:sz w:val="30"/>
           <w:szCs w:val="30"/>
+        </w:rPr>
+      </w:pPr>
+      <w:r>
+        <w:rPr>
+          <w:rFonts w:hint="default" w:ascii="sans-serif" w:hAnsi="sans-serif" w:eastAsia="sans-serif" w:cs="sans-serif"/>
+          <w:i w:val="0"/>
+          <w:iCs w:val="0"/>
+          <w:caps w:val="0"/>
+          <w:color w:val="1A1D23"/>
+          <w:spacing w:val="0"/>
+          <w:sz w:val="30"/>
+          <w:szCs w:val="30"/>
           <w:shd w:val="clear" w:fill="FFFFFF"/>
         </w:rPr>
-      </w:pPr>
-      <w:r>
-        <w:rPr>
-          <w:rFonts w:hint="default" w:ascii="sans-serif" w:hAnsi="sans-serif" w:eastAsia="sans-serif" w:cs="sans-serif"/>
-          <w:i w:val="0"/>
-          <w:iCs w:val="0"/>
-          <w:caps w:val="0"/>
-          <w:color w:val="1A1D23"/>
-          <w:spacing w:val="0"/>
-          <w:sz w:val="30"/>
-          <w:szCs w:val="30"/>
-          <w:shd w:val="clear" w:fill="FFFFFF"/>
-        </w:rPr>
-        <w:t xml:space="preserve">轻度情绪 → 轻松陪聊 中度焦虑 → 深度倾听 + CBT技巧 重度风险 → 推荐专业资源（如心理热线） </w:t>
+        <w:t>首次进入：只问3个问题</w:t>
       </w:r>
     </w:p>
     <w:p>
@@ -3875,7 +3086,7 @@
           <w:szCs w:val="30"/>
           <w:shd w:val="clear" w:fill="FFFFFF"/>
         </w:rPr>
-        <w:t>防沉迷机制（针对青少年）：</w:t>
+        <w:t>"你希望我是什么角色？"（5选1：挚友/知己/搭子/陪伴者/树洞） "你更喜欢什么语气？"（3选1：温柔/活泼/沉稳） "我可以主动找你聊天吗？"（是/偶尔/不用） 后续：在对话中通过自然对话引导完善设置</w:t>
       </w:r>
     </w:p>
     <w:p>
@@ -3903,22 +3114,21 @@
           <w:spacing w:val="0"/>
           <w:sz w:val="30"/>
           <w:szCs w:val="30"/>
+        </w:rPr>
+      </w:pPr>
+      <w:r>
+        <w:rPr>
+          <w:rFonts w:hint="default" w:ascii="sans-serif" w:hAnsi="sans-serif" w:eastAsia="sans-serif" w:cs="sans-serif"/>
+          <w:i w:val="0"/>
+          <w:iCs w:val="0"/>
+          <w:caps w:val="0"/>
+          <w:color w:val="1A1D23"/>
+          <w:spacing w:val="0"/>
+          <w:sz w:val="30"/>
+          <w:szCs w:val="30"/>
           <w:shd w:val="clear" w:fill="FFFFFF"/>
         </w:rPr>
-      </w:pPr>
-      <w:r>
-        <w:rPr>
-          <w:rFonts w:hint="default" w:ascii="sans-serif" w:hAnsi="sans-serif" w:eastAsia="sans-serif" w:cs="sans-serif"/>
-          <w:i w:val="0"/>
-          <w:iCs w:val="0"/>
-          <w:caps w:val="0"/>
-          <w:color w:val="1A1D23"/>
-          <w:spacing w:val="0"/>
-          <w:sz w:val="30"/>
-          <w:szCs w:val="30"/>
-          <w:shd w:val="clear" w:fill="FFFFFF"/>
-        </w:rPr>
-        <w:t>每日对话时长提醒 鼓励线下社交（如"要不要找朋友出去走走？"）</w:t>
+        <w:t>AI："对了，你叫我什么呢？小助手？还是给我起个昵称？" 用户："叫你小月吧" AI：√ 已记住，你可以随时改哦 2. 增加"情境模式"快速切换 灵感来源：你提到的"陪伴场景"可以做成快捷入口</w:t>
       </w:r>
     </w:p>
     <w:p>
@@ -3960,7 +3170,7 @@
           <w:szCs w:val="30"/>
           <w:shd w:val="clear" w:fill="FFFFFF"/>
         </w:rPr>
-        <w:t xml:space="preserve"> 3. 本地优先 + 渐进式公开 = 隐私护城河 竞品问题：</w:t>
+        <w:t>示例：</w:t>
       </w:r>
     </w:p>
     <w:p>
@@ -4002,7 +3212,45 @@
           <w:szCs w:val="30"/>
           <w:shd w:val="clear" w:fill="FFFFFF"/>
         </w:rPr>
-        <w:t>Character.ai默认公开，用户隐私暴露风险 猫箱/星野云端存储，用户担心数据泄露 你的策略：</w:t>
+        <w:t>焦虑模式：语气更温柔，多用肯定句，避免建议（只倾听） 学习模式：理性风格，提供番茄钟，适度督促 助眠模式：慢语速，温柔话术，自动降低消息频率 好处：用户不用反复调设置，场景切换更自然</w:t>
+      </w:r>
+    </w:p>
+    <w:p>
+      <w:pPr>
+        <w:keepNext w:val="0"/>
+        <w:keepLines w:val="0"/>
+        <w:widowControl/>
+        <w:numPr>
+          <w:ilvl w:val="0"/>
+          <w:numId w:val="7"/>
+        </w:numPr>
+        <w:suppressLineNumbers w:val="0"/>
+        <w:pBdr>
+          <w:top w:val="single" w:color="E5E7EB" w:sz="2" w:space="0"/>
+          <w:left w:val="single" w:color="E5E7EB" w:sz="2" w:space="0"/>
+          <w:bottom w:val="single" w:color="E5E7EB" w:sz="2" w:space="0"/>
+          <w:right w:val="single" w:color="E5E7EB" w:sz="2" w:space="0"/>
+        </w:pBdr>
+        <w:spacing w:before="0" w:beforeAutospacing="1" w:after="0" w:afterAutospacing="1"/>
+        <w:ind w:left="720" w:hanging="360"/>
+        <w:rPr>
+          <w:color w:val="1A1D23"/>
+        </w:rPr>
+      </w:pPr>
+      <w:r>
+        <w:rPr>
+          <w:rFonts w:hint="default" w:ascii="sans-serif" w:hAnsi="sans-serif" w:eastAsia="sans-serif" w:cs="sans-serif"/>
+          <w:i w:val="0"/>
+          <w:iCs w:val="0"/>
+          <w:caps w:val="0"/>
+          <w:color w:val="1A1D23"/>
+          <w:spacing w:val="0"/>
+          <w:sz w:val="30"/>
+          <w:szCs w:val="30"/>
+          <w:bdr w:val="single" w:color="E5E7EB" w:sz="2" w:space="0"/>
+          <w:shd w:val="clear" w:fill="FFFFFF"/>
+        </w:rPr>
+        <w:t>数据驱动的个性化进化 目前缺失：AI如何根据用户使用逐渐"成长"</w:t>
       </w:r>
     </w:p>
     <w:p>
@@ -4044,7 +3292,7 @@
           <w:szCs w:val="30"/>
           <w:shd w:val="clear" w:fill="FFFFFF"/>
         </w:rPr>
-        <w:t>初期：所有对话本地加密存储（Electron/PWA实现） 可选：匿名化数据用于优化模型（需明确告知） 差异点：设置**"记忆自毁"**功能（如7天后自动遗忘敏感话题） 4. 轻量级部署 + 移动优先 = 触达优势 竞品现状：</w:t>
+        <w:t>建议加入：</w:t>
       </w:r>
     </w:p>
     <w:p>
@@ -4072,22 +3320,21 @@
           <w:spacing w:val="0"/>
           <w:sz w:val="30"/>
           <w:szCs w:val="30"/>
+        </w:rPr>
+      </w:pPr>
+      <w:r>
+        <w:rPr>
+          <w:rFonts w:hint="default" w:ascii="sans-serif" w:hAnsi="sans-serif" w:eastAsia="sans-serif" w:cs="sans-serif"/>
+          <w:i w:val="0"/>
+          <w:iCs w:val="0"/>
+          <w:caps w:val="0"/>
+          <w:color w:val="1A1D23"/>
+          <w:spacing w:val="0"/>
+          <w:sz w:val="30"/>
+          <w:szCs w:val="30"/>
           <w:shd w:val="clear" w:fill="FFFFFF"/>
         </w:rPr>
-      </w:pPr>
-      <w:r>
-        <w:rPr>
-          <w:rFonts w:hint="default" w:ascii="sans-serif" w:hAnsi="sans-serif" w:eastAsia="sans-serif" w:cs="sans-serif"/>
-          <w:i w:val="0"/>
-          <w:iCs w:val="0"/>
-          <w:caps w:val="0"/>
-          <w:color w:val="1A1D23"/>
-          <w:spacing w:val="0"/>
-          <w:sz w:val="30"/>
-          <w:szCs w:val="30"/>
-          <w:shd w:val="clear" w:fill="FFFFFF"/>
-        </w:rPr>
-        <w:t xml:space="preserve"> ✅ 模块化设置逻辑清晰：快速设置 → 高级自定义，降低门槛 </w:t>
+        <w:t>对话分析仪表板（可选）：</w:t>
       </w:r>
     </w:p>
     <w:p>
@@ -4129,45 +3376,7 @@
           <w:szCs w:val="30"/>
           <w:shd w:val="clear" w:fill="FFFFFF"/>
         </w:rPr>
-        <w:t>"治愈树洞"角色定位准确：对标青少年需求 记忆与隐私模块：是核心竞争力，必须深度打磨 需要优化的部分 ⚠️</w:t>
-      </w:r>
-    </w:p>
-    <w:p>
-      <w:pPr>
-        <w:keepNext w:val="0"/>
-        <w:keepLines w:val="0"/>
-        <w:widowControl/>
-        <w:numPr>
-          <w:ilvl w:val="0"/>
-          <w:numId w:val="8"/>
-        </w:numPr>
-        <w:suppressLineNumbers w:val="0"/>
-        <w:pBdr>
-          <w:top w:val="single" w:color="E5E7EB" w:sz="2" w:space="0"/>
-          <w:left w:val="single" w:color="E5E7EB" w:sz="2" w:space="0"/>
-          <w:bottom w:val="single" w:color="E5E7EB" w:sz="2" w:space="0"/>
-          <w:right w:val="single" w:color="E5E7EB" w:sz="2" w:space="0"/>
-        </w:pBdr>
-        <w:spacing w:before="0" w:beforeAutospacing="1" w:after="0" w:afterAutospacing="1"/>
-        <w:ind w:left="720" w:hanging="360"/>
-        <w:rPr>
-          <w:color w:val="1A1D23"/>
-        </w:rPr>
-      </w:pPr>
-      <w:r>
-        <w:rPr>
-          <w:rFonts w:hint="default" w:ascii="sans-serif" w:hAnsi="sans-serif" w:eastAsia="sans-serif" w:cs="sans-serif"/>
-          <w:i w:val="0"/>
-          <w:iCs w:val="0"/>
-          <w:caps w:val="0"/>
-          <w:color w:val="1A1D23"/>
-          <w:spacing w:val="0"/>
-          <w:sz w:val="30"/>
-          <w:szCs w:val="30"/>
-          <w:bdr w:val="single" w:color="E5E7EB" w:sz="2" w:space="0"/>
-          <w:shd w:val="clear" w:fill="FFFFFF"/>
-        </w:rPr>
-        <w:t>简化初期选择，降低决策疲劳 问题：你的文档里有太多选项（7大模块），学生用户可能懵 建议：</w:t>
+        <w:t>本周情绪趋势图 常聊话题云 AI陪伴时长统计 AI主动提议调整：</w:t>
       </w:r>
     </w:p>
     <w:p>
@@ -4195,21 +3404,22 @@
           <w:spacing w:val="0"/>
           <w:sz w:val="30"/>
           <w:szCs w:val="30"/>
-        </w:rPr>
-      </w:pPr>
-      <w:r>
-        <w:rPr>
-          <w:rFonts w:hint="default" w:ascii="sans-serif" w:hAnsi="sans-serif" w:eastAsia="sans-serif" w:cs="sans-serif"/>
-          <w:i w:val="0"/>
-          <w:iCs w:val="0"/>
-          <w:caps w:val="0"/>
-          <w:color w:val="1A1D23"/>
-          <w:spacing w:val="0"/>
-          <w:sz w:val="30"/>
-          <w:szCs w:val="30"/>
           <w:shd w:val="clear" w:fill="FFFFFF"/>
         </w:rPr>
-        <w:t>首次进入：只问3个问题</w:t>
+      </w:pPr>
+      <w:r>
+        <w:rPr>
+          <w:rFonts w:hint="default" w:ascii="sans-serif" w:hAnsi="sans-serif" w:eastAsia="sans-serif" w:cs="sans-serif"/>
+          <w:i w:val="0"/>
+          <w:iCs w:val="0"/>
+          <w:caps w:val="0"/>
+          <w:color w:val="1A1D23"/>
+          <w:spacing w:val="0"/>
+          <w:sz w:val="30"/>
+          <w:szCs w:val="30"/>
+          <w:shd w:val="clear" w:fill="FFFFFF"/>
+        </w:rPr>
+        <w:t xml:space="preserve">"我发现你最近经常在深夜找我，要不要我晚上更主动一点？" "你好像不太喜欢我用表情，我改成纯文字可以吗？" </w:t>
       </w:r>
     </w:p>
     <w:p>
@@ -4237,22 +3447,9 @@
           <w:spacing w:val="0"/>
           <w:sz w:val="30"/>
           <w:szCs w:val="30"/>
-        </w:rPr>
-      </w:pPr>
-      <w:r>
-        <w:rPr>
-          <w:rFonts w:hint="default" w:ascii="sans-serif" w:hAnsi="sans-serif" w:eastAsia="sans-serif" w:cs="sans-serif"/>
-          <w:i w:val="0"/>
-          <w:iCs w:val="0"/>
-          <w:caps w:val="0"/>
-          <w:color w:val="1A1D23"/>
-          <w:spacing w:val="0"/>
-          <w:sz w:val="30"/>
-          <w:szCs w:val="30"/>
           <w:shd w:val="clear" w:fill="FFFFFF"/>
         </w:rPr>
-        <w:t>"你希望我是什么角色？"（5选1：挚友/知己/搭子/陪伴者/树洞） "你更喜欢什么语气？"（3选1：温柔/活泼/沉稳） "我可以主动找你聊天吗？"（是/偶尔/不用） 后续：在对话中通过自然对话引导完善设置</w:t>
-      </w:r>
+      </w:pPr>
     </w:p>
     <w:p>
       <w:pPr>
@@ -4260,6 +3457,10 @@
         <w:keepNext w:val="0"/>
         <w:keepLines w:val="0"/>
         <w:widowControl/>
+        <w:numPr>
+          <w:ilvl w:val="0"/>
+          <w:numId w:val="8"/>
+        </w:numPr>
         <w:suppressLineNumbers w:val="0"/>
         <w:pBdr>
           <w:top w:val="single" w:color="E5E7EB" w:sz="2" w:space="0"/>
@@ -4279,397 +3480,34 @@
           <w:spacing w:val="0"/>
           <w:sz w:val="30"/>
           <w:szCs w:val="30"/>
-        </w:rPr>
-      </w:pPr>
-      <w:r>
-        <w:rPr>
-          <w:rFonts w:hint="default" w:ascii="sans-serif" w:hAnsi="sans-serif" w:eastAsia="sans-serif" w:cs="sans-serif"/>
-          <w:i w:val="0"/>
-          <w:iCs w:val="0"/>
-          <w:caps w:val="0"/>
-          <w:color w:val="1A1D23"/>
-          <w:spacing w:val="0"/>
-          <w:sz w:val="30"/>
-          <w:szCs w:val="30"/>
           <w:shd w:val="clear" w:fill="FFFFFF"/>
         </w:rPr>
-        <w:t>AI："对了，你叫我什么呢？小助手？还是给我起个昵称？" 用户："叫你小月吧" AI：√ 已记住，你可以随时改哦 2. 增加"情境模式"快速切换 灵感来源：你提到的"陪伴场景"可以做成快捷入口</w:t>
-      </w:r>
-    </w:p>
+      </w:pPr>
+      <w:bookmarkStart w:id="0" w:name="_GoBack"/>
+      <w:r>
+        <w:rPr>
+          <w:rFonts w:hint="default" w:ascii="sans-serif" w:hAnsi="sans-serif" w:eastAsia="sans-serif" w:cs="sans-serif"/>
+          <w:i w:val="0"/>
+          <w:iCs w:val="0"/>
+          <w:caps w:val="0"/>
+          <w:color w:val="1A1D23"/>
+          <w:spacing w:val="0"/>
+          <w:sz w:val="30"/>
+          <w:szCs w:val="30"/>
+          <w:shd w:val="clear" w:fill="FFFFFF"/>
+        </w:rPr>
+        <w:t>技术实现路径建议</w:t>
+      </w:r>
+    </w:p>
+    <w:bookmarkEnd w:id="0"/>
     <w:p>
       <w:pPr>
         <w:pStyle w:val="2"/>
         <w:keepNext w:val="0"/>
         <w:keepLines w:val="0"/>
         <w:widowControl/>
-        <w:suppressLineNumbers w:val="0"/>
-        <w:pBdr>
-          <w:top w:val="single" w:color="E5E7EB" w:sz="2" w:space="0"/>
-          <w:left w:val="single" w:color="E5E7EB" w:sz="2" w:space="0"/>
-          <w:bottom w:val="single" w:color="E5E7EB" w:sz="2" w:space="0"/>
-          <w:right w:val="single" w:color="E5E7EB" w:sz="2" w:space="0"/>
-        </w:pBdr>
-        <w:shd w:val="clear" w:fill="FFFFFF"/>
-        <w:spacing w:before="0" w:beforeAutospacing="1" w:after="0" w:afterAutospacing="1"/>
-        <w:ind w:left="0" w:right="0" w:firstLine="0"/>
-        <w:rPr>
-          <w:rFonts w:hint="default" w:ascii="sans-serif" w:hAnsi="sans-serif" w:eastAsia="sans-serif" w:cs="sans-serif"/>
-          <w:i w:val="0"/>
-          <w:iCs w:val="0"/>
-          <w:caps w:val="0"/>
-          <w:color w:val="1A1D23"/>
-          <w:spacing w:val="0"/>
-          <w:sz w:val="30"/>
-          <w:szCs w:val="30"/>
-        </w:rPr>
-      </w:pPr>
-      <w:r>
-        <w:rPr>
-          <w:rFonts w:hint="default" w:ascii="sans-serif" w:hAnsi="sans-serif" w:eastAsia="sans-serif" w:cs="sans-serif"/>
-          <w:i w:val="0"/>
-          <w:iCs w:val="0"/>
-          <w:caps w:val="0"/>
-          <w:color w:val="1A1D23"/>
-          <w:spacing w:val="0"/>
-          <w:sz w:val="30"/>
-          <w:szCs w:val="30"/>
-          <w:shd w:val="clear" w:fill="FFFFFF"/>
-        </w:rPr>
-        <w:t>示例：</w:t>
-      </w:r>
-    </w:p>
-    <w:p>
-      <w:pPr>
-        <w:pStyle w:val="2"/>
-        <w:keepNext w:val="0"/>
-        <w:keepLines w:val="0"/>
-        <w:widowControl/>
-        <w:suppressLineNumbers w:val="0"/>
-        <w:pBdr>
-          <w:top w:val="single" w:color="E5E7EB" w:sz="2" w:space="0"/>
-          <w:left w:val="single" w:color="E5E7EB" w:sz="2" w:space="0"/>
-          <w:bottom w:val="single" w:color="E5E7EB" w:sz="2" w:space="0"/>
-          <w:right w:val="single" w:color="E5E7EB" w:sz="2" w:space="0"/>
-        </w:pBdr>
-        <w:shd w:val="clear" w:fill="FFFFFF"/>
-        <w:spacing w:before="0" w:beforeAutospacing="1" w:after="0" w:afterAutospacing="1"/>
-        <w:ind w:left="0" w:right="0" w:firstLine="0"/>
-        <w:rPr>
-          <w:rFonts w:hint="default" w:ascii="sans-serif" w:hAnsi="sans-serif" w:eastAsia="sans-serif" w:cs="sans-serif"/>
-          <w:i w:val="0"/>
-          <w:iCs w:val="0"/>
-          <w:caps w:val="0"/>
-          <w:color w:val="1A1D23"/>
-          <w:spacing w:val="0"/>
-          <w:sz w:val="30"/>
-          <w:szCs w:val="30"/>
-        </w:rPr>
-      </w:pPr>
-      <w:r>
-        <w:rPr>
-          <w:rFonts w:hint="default" w:ascii="sans-serif" w:hAnsi="sans-serif" w:eastAsia="sans-serif" w:cs="sans-serif"/>
-          <w:i w:val="0"/>
-          <w:iCs w:val="0"/>
-          <w:caps w:val="0"/>
-          <w:color w:val="1A1D23"/>
-          <w:spacing w:val="0"/>
-          <w:sz w:val="30"/>
-          <w:szCs w:val="30"/>
-          <w:shd w:val="clear" w:fill="FFFFFF"/>
-        </w:rPr>
-        <w:t>焦虑模式：语气更温柔，多用肯定句，避免建议（只倾听） 学习模式：理性风格，提供番茄钟，适度督促 助眠模式：慢语速，温柔话术，自动降低消息频率 好处：用户不用反复调设置，场景切换更自然</w:t>
-      </w:r>
-    </w:p>
-    <w:p>
-      <w:pPr>
-        <w:keepNext w:val="0"/>
-        <w:keepLines w:val="0"/>
-        <w:widowControl/>
-        <w:numPr>
-          <w:ilvl w:val="0"/>
-          <w:numId w:val="9"/>
-        </w:numPr>
-        <w:suppressLineNumbers w:val="0"/>
-        <w:pBdr>
-          <w:top w:val="single" w:color="E5E7EB" w:sz="2" w:space="0"/>
-          <w:left w:val="single" w:color="E5E7EB" w:sz="2" w:space="0"/>
-          <w:bottom w:val="single" w:color="E5E7EB" w:sz="2" w:space="0"/>
-          <w:right w:val="single" w:color="E5E7EB" w:sz="2" w:space="0"/>
-        </w:pBdr>
-        <w:spacing w:before="0" w:beforeAutospacing="1" w:after="0" w:afterAutospacing="1"/>
-        <w:ind w:left="720" w:hanging="360"/>
-        <w:rPr>
-          <w:color w:val="1A1D23"/>
-        </w:rPr>
-      </w:pPr>
-      <w:r>
-        <w:rPr>
-          <w:rFonts w:hint="default" w:ascii="sans-serif" w:hAnsi="sans-serif" w:eastAsia="sans-serif" w:cs="sans-serif"/>
-          <w:i w:val="0"/>
-          <w:iCs w:val="0"/>
-          <w:caps w:val="0"/>
-          <w:color w:val="1A1D23"/>
-          <w:spacing w:val="0"/>
-          <w:sz w:val="30"/>
-          <w:szCs w:val="30"/>
-          <w:bdr w:val="single" w:color="E5E7EB" w:sz="2" w:space="0"/>
-          <w:shd w:val="clear" w:fill="FFFFFF"/>
-        </w:rPr>
-        <w:t>数据驱动的个性化进化 目前缺失：AI如何根据用户使用逐渐"成长"</w:t>
-      </w:r>
-    </w:p>
-    <w:p>
-      <w:pPr>
-        <w:pStyle w:val="2"/>
-        <w:keepNext w:val="0"/>
-        <w:keepLines w:val="0"/>
-        <w:widowControl/>
-        <w:suppressLineNumbers w:val="0"/>
-        <w:pBdr>
-          <w:top w:val="single" w:color="E5E7EB" w:sz="2" w:space="0"/>
-          <w:left w:val="single" w:color="E5E7EB" w:sz="2" w:space="0"/>
-          <w:bottom w:val="single" w:color="E5E7EB" w:sz="2" w:space="0"/>
-          <w:right w:val="single" w:color="E5E7EB" w:sz="2" w:space="0"/>
-        </w:pBdr>
-        <w:shd w:val="clear" w:fill="FFFFFF"/>
-        <w:spacing w:before="0" w:beforeAutospacing="1" w:after="0" w:afterAutospacing="1"/>
-        <w:ind w:left="0" w:right="0" w:firstLine="0"/>
-        <w:rPr>
-          <w:rFonts w:hint="default" w:ascii="sans-serif" w:hAnsi="sans-serif" w:eastAsia="sans-serif" w:cs="sans-serif"/>
-          <w:i w:val="0"/>
-          <w:iCs w:val="0"/>
-          <w:caps w:val="0"/>
-          <w:color w:val="1A1D23"/>
-          <w:spacing w:val="0"/>
-          <w:sz w:val="30"/>
-          <w:szCs w:val="30"/>
-        </w:rPr>
-      </w:pPr>
-      <w:r>
-        <w:rPr>
-          <w:rFonts w:hint="default" w:ascii="sans-serif" w:hAnsi="sans-serif" w:eastAsia="sans-serif" w:cs="sans-serif"/>
-          <w:i w:val="0"/>
-          <w:iCs w:val="0"/>
-          <w:caps w:val="0"/>
-          <w:color w:val="1A1D23"/>
-          <w:spacing w:val="0"/>
-          <w:sz w:val="30"/>
-          <w:szCs w:val="30"/>
-          <w:shd w:val="clear" w:fill="FFFFFF"/>
-        </w:rPr>
-        <w:t>建议加入：</w:t>
-      </w:r>
-    </w:p>
-    <w:p>
-      <w:pPr>
-        <w:pStyle w:val="2"/>
-        <w:keepNext w:val="0"/>
-        <w:keepLines w:val="0"/>
-        <w:widowControl/>
-        <w:suppressLineNumbers w:val="0"/>
-        <w:pBdr>
-          <w:top w:val="single" w:color="E5E7EB" w:sz="2" w:space="0"/>
-          <w:left w:val="single" w:color="E5E7EB" w:sz="2" w:space="0"/>
-          <w:bottom w:val="single" w:color="E5E7EB" w:sz="2" w:space="0"/>
-          <w:right w:val="single" w:color="E5E7EB" w:sz="2" w:space="0"/>
-        </w:pBdr>
-        <w:shd w:val="clear" w:fill="FFFFFF"/>
-        <w:spacing w:before="0" w:beforeAutospacing="1" w:after="0" w:afterAutospacing="1"/>
-        <w:ind w:left="0" w:right="0" w:firstLine="0"/>
-        <w:rPr>
-          <w:rFonts w:hint="default" w:ascii="sans-serif" w:hAnsi="sans-serif" w:eastAsia="sans-serif" w:cs="sans-serif"/>
-          <w:i w:val="0"/>
-          <w:iCs w:val="0"/>
-          <w:caps w:val="0"/>
-          <w:color w:val="1A1D23"/>
-          <w:spacing w:val="0"/>
-          <w:sz w:val="30"/>
-          <w:szCs w:val="30"/>
-        </w:rPr>
-      </w:pPr>
-      <w:r>
-        <w:rPr>
-          <w:rFonts w:hint="default" w:ascii="sans-serif" w:hAnsi="sans-serif" w:eastAsia="sans-serif" w:cs="sans-serif"/>
-          <w:i w:val="0"/>
-          <w:iCs w:val="0"/>
-          <w:caps w:val="0"/>
-          <w:color w:val="1A1D23"/>
-          <w:spacing w:val="0"/>
-          <w:sz w:val="30"/>
-          <w:szCs w:val="30"/>
-          <w:shd w:val="clear" w:fill="FFFFFF"/>
-        </w:rPr>
-        <w:t>对话分析仪表板（可选）：</w:t>
-      </w:r>
-    </w:p>
-    <w:p>
-      <w:pPr>
-        <w:pStyle w:val="2"/>
-        <w:keepNext w:val="0"/>
-        <w:keepLines w:val="0"/>
-        <w:widowControl/>
-        <w:suppressLineNumbers w:val="0"/>
-        <w:pBdr>
-          <w:top w:val="single" w:color="E5E7EB" w:sz="2" w:space="0"/>
-          <w:left w:val="single" w:color="E5E7EB" w:sz="2" w:space="0"/>
-          <w:bottom w:val="single" w:color="E5E7EB" w:sz="2" w:space="0"/>
-          <w:right w:val="single" w:color="E5E7EB" w:sz="2" w:space="0"/>
-        </w:pBdr>
-        <w:shd w:val="clear" w:fill="FFFFFF"/>
-        <w:spacing w:before="0" w:beforeAutospacing="1" w:after="0" w:afterAutospacing="1"/>
-        <w:ind w:left="0" w:right="0" w:firstLine="0"/>
-        <w:rPr>
-          <w:rFonts w:hint="default" w:ascii="sans-serif" w:hAnsi="sans-serif" w:eastAsia="sans-serif" w:cs="sans-serif"/>
-          <w:i w:val="0"/>
-          <w:iCs w:val="0"/>
-          <w:caps w:val="0"/>
-          <w:color w:val="1A1D23"/>
-          <w:spacing w:val="0"/>
-          <w:sz w:val="30"/>
-          <w:szCs w:val="30"/>
-        </w:rPr>
-      </w:pPr>
-      <w:r>
-        <w:rPr>
-          <w:rFonts w:hint="default" w:ascii="sans-serif" w:hAnsi="sans-serif" w:eastAsia="sans-serif" w:cs="sans-serif"/>
-          <w:i w:val="0"/>
-          <w:iCs w:val="0"/>
-          <w:caps w:val="0"/>
-          <w:color w:val="1A1D23"/>
-          <w:spacing w:val="0"/>
-          <w:sz w:val="30"/>
-          <w:szCs w:val="30"/>
-          <w:shd w:val="clear" w:fill="FFFFFF"/>
-        </w:rPr>
-        <w:t>本周情绪趋势图 常聊话题云 AI陪伴时长统计 AI主动提议调整：</w:t>
-      </w:r>
-    </w:p>
-    <w:p>
-      <w:pPr>
-        <w:pStyle w:val="2"/>
-        <w:keepNext w:val="0"/>
-        <w:keepLines w:val="0"/>
-        <w:widowControl/>
-        <w:suppressLineNumbers w:val="0"/>
-        <w:pBdr>
-          <w:top w:val="single" w:color="E5E7EB" w:sz="2" w:space="0"/>
-          <w:left w:val="single" w:color="E5E7EB" w:sz="2" w:space="0"/>
-          <w:bottom w:val="single" w:color="E5E7EB" w:sz="2" w:space="0"/>
-          <w:right w:val="single" w:color="E5E7EB" w:sz="2" w:space="0"/>
-        </w:pBdr>
-        <w:shd w:val="clear" w:fill="FFFFFF"/>
-        <w:spacing w:before="0" w:beforeAutospacing="1" w:after="0" w:afterAutospacing="1"/>
-        <w:ind w:left="0" w:right="0" w:firstLine="0"/>
-        <w:rPr>
-          <w:rFonts w:hint="default" w:ascii="sans-serif" w:hAnsi="sans-serif" w:eastAsia="sans-serif" w:cs="sans-serif"/>
-          <w:i w:val="0"/>
-          <w:iCs w:val="0"/>
-          <w:caps w:val="0"/>
-          <w:color w:val="1A1D23"/>
-          <w:spacing w:val="0"/>
-          <w:sz w:val="30"/>
-          <w:szCs w:val="30"/>
-          <w:shd w:val="clear" w:fill="FFFFFF"/>
-        </w:rPr>
-      </w:pPr>
-      <w:r>
-        <w:rPr>
-          <w:rFonts w:hint="default" w:ascii="sans-serif" w:hAnsi="sans-serif" w:eastAsia="sans-serif" w:cs="sans-serif"/>
-          <w:i w:val="0"/>
-          <w:iCs w:val="0"/>
-          <w:caps w:val="0"/>
-          <w:color w:val="1A1D23"/>
-          <w:spacing w:val="0"/>
-          <w:sz w:val="30"/>
-          <w:szCs w:val="30"/>
-          <w:shd w:val="clear" w:fill="FFFFFF"/>
-        </w:rPr>
-        <w:t xml:space="preserve">"我发现你最近经常在深夜找我，要不要我晚上更主动一点？" "你好像不太喜欢我用表情，我改成纯文字可以吗？" </w:t>
-      </w:r>
-    </w:p>
-    <w:p>
-      <w:pPr>
-        <w:pStyle w:val="2"/>
-        <w:keepNext w:val="0"/>
-        <w:keepLines w:val="0"/>
-        <w:widowControl/>
-        <w:suppressLineNumbers w:val="0"/>
-        <w:pBdr>
-          <w:top w:val="single" w:color="E5E7EB" w:sz="2" w:space="0"/>
-          <w:left w:val="single" w:color="E5E7EB" w:sz="2" w:space="0"/>
-          <w:bottom w:val="single" w:color="E5E7EB" w:sz="2" w:space="0"/>
-          <w:right w:val="single" w:color="E5E7EB" w:sz="2" w:space="0"/>
-        </w:pBdr>
-        <w:shd w:val="clear" w:fill="FFFFFF"/>
-        <w:spacing w:before="0" w:beforeAutospacing="1" w:after="0" w:afterAutospacing="1"/>
-        <w:ind w:left="0" w:right="0" w:firstLine="0"/>
-        <w:rPr>
-          <w:rFonts w:hint="default" w:ascii="sans-serif" w:hAnsi="sans-serif" w:eastAsia="sans-serif" w:cs="sans-serif"/>
-          <w:i w:val="0"/>
-          <w:iCs w:val="0"/>
-          <w:caps w:val="0"/>
-          <w:color w:val="1A1D23"/>
-          <w:spacing w:val="0"/>
-          <w:sz w:val="30"/>
-          <w:szCs w:val="30"/>
-          <w:shd w:val="clear" w:fill="FFFFFF"/>
-        </w:rPr>
-      </w:pPr>
-    </w:p>
-    <w:p>
-      <w:pPr>
-        <w:pStyle w:val="2"/>
-        <w:keepNext w:val="0"/>
-        <w:keepLines w:val="0"/>
-        <w:widowControl/>
-        <w:numPr>
-          <w:ilvl w:val="0"/>
-          <w:numId w:val="10"/>
-        </w:numPr>
-        <w:suppressLineNumbers w:val="0"/>
-        <w:pBdr>
-          <w:top w:val="single" w:color="E5E7EB" w:sz="2" w:space="0"/>
-          <w:left w:val="single" w:color="E5E7EB" w:sz="2" w:space="0"/>
-          <w:bottom w:val="single" w:color="E5E7EB" w:sz="2" w:space="0"/>
-          <w:right w:val="single" w:color="E5E7EB" w:sz="2" w:space="0"/>
-        </w:pBdr>
-        <w:shd w:val="clear" w:fill="FFFFFF"/>
-        <w:spacing w:before="0" w:beforeAutospacing="1" w:after="0" w:afterAutospacing="1"/>
-        <w:ind w:left="0" w:right="0" w:firstLine="0"/>
-        <w:rPr>
-          <w:rFonts w:hint="default" w:ascii="sans-serif" w:hAnsi="sans-serif" w:eastAsia="sans-serif" w:cs="sans-serif"/>
-          <w:i w:val="0"/>
-          <w:iCs w:val="0"/>
-          <w:caps w:val="0"/>
-          <w:color w:val="1A1D23"/>
-          <w:spacing w:val="0"/>
-          <w:sz w:val="30"/>
-          <w:szCs w:val="30"/>
-          <w:shd w:val="clear" w:fill="FFFFFF"/>
-        </w:rPr>
-      </w:pPr>
-      <w:r>
-        <w:rPr>
-          <w:rFonts w:hint="default" w:ascii="sans-serif" w:hAnsi="sans-serif" w:eastAsia="sans-serif" w:cs="sans-serif"/>
-          <w:i w:val="0"/>
-          <w:iCs w:val="0"/>
-          <w:caps w:val="0"/>
-          <w:color w:val="1A1D23"/>
-          <w:spacing w:val="0"/>
-          <w:sz w:val="30"/>
-          <w:szCs w:val="30"/>
-          <w:shd w:val="clear" w:fill="FFFFFF"/>
-        </w:rPr>
-        <w:t>技术实现路径建议</w:t>
-      </w:r>
-    </w:p>
-    <w:p>
-      <w:pPr>
-        <w:pStyle w:val="2"/>
-        <w:keepNext w:val="0"/>
-        <w:keepLines w:val="0"/>
-        <w:widowControl/>
-        <w:numPr>
+        <w:numPr>
+          <w:ilvl w:val="0"/>
           <w:numId w:val="0"/>
         </w:numPr>
         <w:suppressLineNumbers w:val="0"/>
@@ -4706,23 +3544,7 @@
           <w:szCs w:val="30"/>
           <w:shd w:val="clear" w:fill="FFFFFF"/>
         </w:rPr>
-        <w:t xml:space="preserve"> Phase 1: MVP</w:t>
-      </w:r>
-      <w:bookmarkStart w:id="0" w:name="_GoBack"/>
-      <w:bookmarkEnd w:id="0"/>
-      <w:r>
-        <w:rPr>
-          <w:rFonts w:hint="default" w:ascii="sans-serif" w:hAnsi="sans-serif" w:eastAsia="sans-serif" w:cs="sans-serif"/>
-          <w:i w:val="0"/>
-          <w:iCs w:val="0"/>
-          <w:caps w:val="0"/>
-          <w:color w:val="1A1D23"/>
-          <w:spacing w:val="0"/>
-          <w:sz w:val="30"/>
-          <w:szCs w:val="30"/>
-          <w:shd w:val="clear" w:fill="FFFFFF"/>
-        </w:rPr>
-        <w:t xml:space="preserve"> 技术栈：Next.js/Nuxt.js + PWA + 本地存储（IndexedDB） LLM方案： 选项A：Claude API（情感理解强，适合陪伴场景）</w:t>
+        <w:t xml:space="preserve"> Phase 1: MVP 技术栈：Next.js/Nuxt.js + PWA + 本地存储（IndexedDB） LLM方案： 选项A：Claude API（情感理解强，适合陪伴场景）</w:t>
       </w:r>
     </w:p>
     <w:p>
@@ -4732,6 +3554,7 @@
         <w:keepLines w:val="0"/>
         <w:widowControl/>
         <w:numPr>
+          <w:ilvl w:val="0"/>
           <w:numId w:val="0"/>
         </w:numPr>
         <w:suppressLineNumbers w:val="0"/>
@@ -4778,6 +3601,7 @@
         <w:keepLines w:val="0"/>
         <w:widowControl/>
         <w:numPr>
+          <w:ilvl w:val="0"/>
           <w:numId w:val="0"/>
         </w:numPr>
         <w:suppressLineNumbers w:val="0"/>
@@ -4810,6 +3634,7 @@
         <w:keepLines w:val="0"/>
         <w:widowControl/>
         <w:numPr>
+          <w:ilvl w:val="0"/>
           <w:numId w:val="0"/>
         </w:numPr>
         <w:suppressLineNumbers w:val="0"/>
@@ -4871,155 +3696,6 @@
 <file path=word/numbering.xml><?xml version="1.0" encoding="utf-8"?>
 <w:numbering xmlns:wpc="http://schemas.microsoft.com/office/word/2010/wordprocessingCanvas" xmlns:mc="http://schemas.openxmlformats.org/markup-compatibility/2006" xmlns:o="urn:schemas-microsoft-com:office:office" xmlns:r="http://schemas.openxmlformats.org/officeDocument/2006/relationships" xmlns:m="http://schemas.openxmlformats.org/officeDocument/2006/math" xmlns:v="urn:schemas-microsoft-com:vml" xmlns:wp14="http://schemas.microsoft.com/office/word/2010/wordprocessingDrawing" xmlns:wp="http://schemas.openxmlformats.org/drawingml/2006/wordprocessingDrawing" xmlns:w10="urn:schemas-microsoft-com:office:word" xmlns:w="http://schemas.openxmlformats.org/wordprocessingml/2006/main" xmlns:w14="http://schemas.microsoft.com/office/word/2010/wordml" xmlns:wpg="http://schemas.microsoft.com/office/word/2010/wordprocessingGroup" xmlns:wpi="http://schemas.microsoft.com/office/word/2010/wordprocessingInk" xmlns:wne="http://schemas.microsoft.com/office/word/2006/wordml" xmlns:wps="http://schemas.microsoft.com/office/word/2010/wordprocessingShape" xmlns:wpsCustomData="http://www.wps.cn/officeDocument/2013/wpsCustomData" mc:Ignorable="w14 wp14">
   <w:abstractNum w:abstractNumId="0">
-    <w:nsid w:val="9B2C003E"/>
-    <w:multiLevelType w:val="multilevel"/>
-    <w:tmpl w:val="9B2C003E"/>
-    <w:lvl w:ilvl="0" w:tentative="0">
-      <w:start w:val="1"/>
-      <w:numFmt w:val="decimal"/>
-      <w:lvlText w:val="%1."/>
-      <w:lvlJc w:val="left"/>
-      <w:pPr>
-        <w:tabs>
-          <w:tab w:val="left" w:pos="720"/>
-        </w:tabs>
-        <w:ind w:left="720" w:hanging="360"/>
-      </w:pPr>
-      <w:rPr>
-        <w:sz w:val="24"/>
-        <w:szCs w:val="24"/>
-      </w:rPr>
-    </w:lvl>
-    <w:lvl w:ilvl="1" w:tentative="0">
-      <w:start w:val="1"/>
-      <w:numFmt w:val="decimal"/>
-      <w:lvlText w:val="%2."/>
-      <w:lvlJc w:val="left"/>
-      <w:pPr>
-        <w:tabs>
-          <w:tab w:val="left" w:pos="1440"/>
-        </w:tabs>
-        <w:ind w:left="1440" w:hanging="360"/>
-      </w:pPr>
-      <w:rPr>
-        <w:sz w:val="24"/>
-        <w:szCs w:val="24"/>
-      </w:rPr>
-    </w:lvl>
-    <w:lvl w:ilvl="2" w:tentative="0">
-      <w:start w:val="1"/>
-      <w:numFmt w:val="decimal"/>
-      <w:lvlText w:val="%3."/>
-      <w:lvlJc w:val="left"/>
-      <w:pPr>
-        <w:tabs>
-          <w:tab w:val="left" w:pos="2160"/>
-        </w:tabs>
-        <w:ind w:left="2160" w:hanging="360"/>
-      </w:pPr>
-      <w:rPr>
-        <w:sz w:val="24"/>
-        <w:szCs w:val="24"/>
-      </w:rPr>
-    </w:lvl>
-    <w:lvl w:ilvl="3" w:tentative="0">
-      <w:start w:val="1"/>
-      <w:numFmt w:val="decimal"/>
-      <w:lvlText w:val="%4."/>
-      <w:lvlJc w:val="left"/>
-      <w:pPr>
-        <w:tabs>
-          <w:tab w:val="left" w:pos="2517"/>
-        </w:tabs>
-        <w:ind w:left="2880" w:hanging="360"/>
-      </w:pPr>
-      <w:rPr>
-        <w:sz w:val="24"/>
-        <w:szCs w:val="24"/>
-      </w:rPr>
-    </w:lvl>
-    <w:lvl w:ilvl="4" w:tentative="0">
-      <w:start w:val="1"/>
-      <w:numFmt w:val="decimal"/>
-      <w:lvlText w:val="%5."/>
-      <w:lvlJc w:val="left"/>
-      <w:pPr>
-        <w:tabs>
-          <w:tab w:val="left" w:pos="3238"/>
-        </w:tabs>
-        <w:ind w:left="3600" w:hanging="360"/>
-      </w:pPr>
-      <w:rPr>
-        <w:sz w:val="24"/>
-        <w:szCs w:val="24"/>
-      </w:rPr>
-    </w:lvl>
-    <w:lvl w:ilvl="5" w:tentative="0">
-      <w:start w:val="1"/>
-      <w:numFmt w:val="decimal"/>
-      <w:lvlText w:val="%6."/>
-      <w:lvlJc w:val="left"/>
-      <w:pPr>
-        <w:tabs>
-          <w:tab w:val="left" w:pos="3958"/>
-        </w:tabs>
-        <w:ind w:left="4320" w:hanging="360"/>
-      </w:pPr>
-      <w:rPr>
-        <w:sz w:val="24"/>
-        <w:szCs w:val="24"/>
-      </w:rPr>
-    </w:lvl>
-    <w:lvl w:ilvl="6" w:tentative="0">
-      <w:start w:val="1"/>
-      <w:numFmt w:val="decimal"/>
-      <w:lvlText w:val="%7."/>
-      <w:lvlJc w:val="left"/>
-      <w:pPr>
-        <w:tabs>
-          <w:tab w:val="left" w:pos="4678"/>
-        </w:tabs>
-        <w:ind w:left="5040" w:hanging="360"/>
-      </w:pPr>
-      <w:rPr>
-        <w:sz w:val="24"/>
-        <w:szCs w:val="24"/>
-      </w:rPr>
-    </w:lvl>
-    <w:lvl w:ilvl="7" w:tentative="0">
-      <w:start w:val="1"/>
-      <w:numFmt w:val="decimal"/>
-      <w:lvlText w:val="%8."/>
-      <w:lvlJc w:val="left"/>
-      <w:pPr>
-        <w:tabs>
-          <w:tab w:val="left" w:pos="5398"/>
-        </w:tabs>
-        <w:ind w:left="5760" w:hanging="360"/>
-      </w:pPr>
-      <w:rPr>
-        <w:sz w:val="24"/>
-        <w:szCs w:val="24"/>
-      </w:rPr>
-    </w:lvl>
-    <w:lvl w:ilvl="8" w:tentative="0">
-      <w:start w:val="1"/>
-      <w:numFmt w:val="decimal"/>
-      <w:lvlText w:val="%9."/>
-      <w:lvlJc w:val="left"/>
-      <w:pPr>
-        <w:tabs>
-          <w:tab w:val="left" w:pos="6118"/>
-        </w:tabs>
-        <w:ind w:left="6480" w:hanging="360"/>
-      </w:pPr>
-      <w:rPr>
-        <w:sz w:val="24"/>
-        <w:szCs w:val="24"/>
-      </w:rPr>
-    </w:lvl>
-  </w:abstractNum>
-  <w:abstractNum w:abstractNumId="1">
     <w:nsid w:val="9EF63AD2"/>
     <w:multiLevelType w:val="singleLevel"/>
     <w:tmpl w:val="9EF63AD2"/>
@@ -5034,7 +3710,7 @@
       </w:rPr>
     </w:lvl>
   </w:abstractNum>
-  <w:abstractNum w:abstractNumId="2">
+  <w:abstractNum w:abstractNumId="1">
     <w:nsid w:val="BE9AEBC7"/>
     <w:multiLevelType w:val="multilevel"/>
     <w:tmpl w:val="BE9AEBC7"/>
@@ -5183,7 +3859,7 @@
       </w:rPr>
     </w:lvl>
   </w:abstractNum>
-  <w:abstractNum w:abstractNumId="3">
+  <w:abstractNum w:abstractNumId="2">
     <w:nsid w:val="BEF35271"/>
     <w:multiLevelType w:val="multilevel"/>
     <w:tmpl w:val="BEF35271"/>
@@ -5269,10 +3945,123 @@
       </w:pPr>
     </w:lvl>
   </w:abstractNum>
+  <w:abstractNum w:abstractNumId="3">
+    <w:nsid w:val="FFFEB7C6"/>
+    <w:multiLevelType w:val="multilevel"/>
+    <w:tmpl w:val="FFFEB7C6"/>
+    <w:lvl w:ilvl="0" w:tentative="0">
+      <w:start w:val="1"/>
+      <w:numFmt w:val="bullet"/>
+      <w:lvlText w:val=""/>
+      <w:lvlJc w:val="left"/>
+      <w:pPr>
+        <w:ind w:left="420" w:hanging="420"/>
+      </w:pPr>
+      <w:rPr>
+        <w:rFonts w:ascii="Wingdings" w:hAnsi="Wingdings"/>
+      </w:rPr>
+    </w:lvl>
+    <w:lvl w:ilvl="1" w:tentative="0">
+      <w:start w:val="1"/>
+      <w:numFmt w:val="bullet"/>
+      <w:lvlText w:val=""/>
+      <w:lvlJc w:val="left"/>
+      <w:pPr>
+        <w:ind w:left="840" w:hanging="420"/>
+      </w:pPr>
+      <w:rPr>
+        <w:rFonts w:ascii="Wingdings" w:hAnsi="Wingdings"/>
+      </w:rPr>
+    </w:lvl>
+    <w:lvl w:ilvl="2" w:tentative="0">
+      <w:start w:val="1"/>
+      <w:numFmt w:val="bullet"/>
+      <w:lvlText w:val=""/>
+      <w:lvlJc w:val="left"/>
+      <w:pPr>
+        <w:ind w:left="1260" w:hanging="420"/>
+      </w:pPr>
+      <w:rPr>
+        <w:rFonts w:ascii="Wingdings" w:hAnsi="Wingdings"/>
+      </w:rPr>
+    </w:lvl>
+    <w:lvl w:ilvl="3" w:tentative="0">
+      <w:start w:val="1"/>
+      <w:numFmt w:val="bullet"/>
+      <w:lvlText w:val=""/>
+      <w:lvlJc w:val="left"/>
+      <w:pPr>
+        <w:ind w:left="1680" w:hanging="420"/>
+      </w:pPr>
+      <w:rPr>
+        <w:rFonts w:ascii="Wingdings" w:hAnsi="Wingdings"/>
+      </w:rPr>
+    </w:lvl>
+    <w:lvl w:ilvl="4" w:tentative="0">
+      <w:start w:val="1"/>
+      <w:numFmt w:val="bullet"/>
+      <w:lvlText w:val=""/>
+      <w:lvlJc w:val="left"/>
+      <w:pPr>
+        <w:ind w:left="2100" w:hanging="420"/>
+      </w:pPr>
+      <w:rPr>
+        <w:rFonts w:ascii="Wingdings" w:hAnsi="Wingdings"/>
+      </w:rPr>
+    </w:lvl>
+    <w:lvl w:ilvl="5" w:tentative="0">
+      <w:start w:val="1"/>
+      <w:numFmt w:val="bullet"/>
+      <w:lvlText w:val=""/>
+      <w:lvlJc w:val="left"/>
+      <w:pPr>
+        <w:ind w:left="2520" w:hanging="420"/>
+      </w:pPr>
+      <w:rPr>
+        <w:rFonts w:ascii="Wingdings" w:hAnsi="Wingdings"/>
+      </w:rPr>
+    </w:lvl>
+    <w:lvl w:ilvl="6" w:tentative="0">
+      <w:start w:val="1"/>
+      <w:numFmt w:val="bullet"/>
+      <w:lvlText w:val=""/>
+      <w:lvlJc w:val="left"/>
+      <w:pPr>
+        <w:ind w:left="2940" w:hanging="420"/>
+      </w:pPr>
+      <w:rPr>
+        <w:rFonts w:ascii="Wingdings" w:hAnsi="Wingdings"/>
+      </w:rPr>
+    </w:lvl>
+    <w:lvl w:ilvl="7" w:tentative="0">
+      <w:start w:val="1"/>
+      <w:numFmt w:val="bullet"/>
+      <w:lvlText w:val=""/>
+      <w:lvlJc w:val="left"/>
+      <w:pPr>
+        <w:ind w:left="3360" w:hanging="420"/>
+      </w:pPr>
+      <w:rPr>
+        <w:rFonts w:ascii="Wingdings" w:hAnsi="Wingdings"/>
+      </w:rPr>
+    </w:lvl>
+    <w:lvl w:ilvl="8" w:tentative="0">
+      <w:start w:val="1"/>
+      <w:numFmt w:val="bullet"/>
+      <w:lvlText w:val=""/>
+      <w:lvlJc w:val="left"/>
+      <w:pPr>
+        <w:ind w:left="3780" w:hanging="420"/>
+      </w:pPr>
+      <w:rPr>
+        <w:rFonts w:ascii="Wingdings" w:hAnsi="Wingdings"/>
+      </w:rPr>
+    </w:lvl>
+  </w:abstractNum>
   <w:abstractNum w:abstractNumId="4">
-    <w:nsid w:val="FEA7872E"/>
+    <w:nsid w:val="6CFBD138"/>
     <w:multiLevelType w:val="multilevel"/>
-    <w:tmpl w:val="FEA7872E"/>
+    <w:tmpl w:val="6CFBD138"/>
     <w:lvl w:ilvl="0" w:tentative="0">
       <w:start w:val="1"/>
       <w:numFmt w:val="decimal"/>
@@ -5418,309 +4207,41 @@
       </w:rPr>
     </w:lvl>
   </w:abstractNum>
-  <w:abstractNum w:abstractNumId="5">
-    <w:nsid w:val="FFFEB7C6"/>
-    <w:multiLevelType w:val="multilevel"/>
-    <w:tmpl w:val="FFFEB7C6"/>
-    <w:lvl w:ilvl="0" w:tentative="0">
-      <w:start w:val="1"/>
-      <w:numFmt w:val="bullet"/>
-      <w:lvlText w:val=""/>
-      <w:lvlJc w:val="left"/>
-      <w:pPr>
-        <w:ind w:left="420" w:hanging="420"/>
-      </w:pPr>
-      <w:rPr>
-        <w:rFonts w:ascii="Wingdings" w:hAnsi="Wingdings"/>
-      </w:rPr>
-    </w:lvl>
-    <w:lvl w:ilvl="1" w:tentative="0">
-      <w:start w:val="1"/>
-      <w:numFmt w:val="bullet"/>
-      <w:lvlText w:val=""/>
-      <w:lvlJc w:val="left"/>
-      <w:pPr>
-        <w:ind w:left="840" w:hanging="420"/>
-      </w:pPr>
-      <w:rPr>
-        <w:rFonts w:ascii="Wingdings" w:hAnsi="Wingdings"/>
-      </w:rPr>
-    </w:lvl>
-    <w:lvl w:ilvl="2" w:tentative="0">
-      <w:start w:val="1"/>
-      <w:numFmt w:val="bullet"/>
-      <w:lvlText w:val=""/>
-      <w:lvlJc w:val="left"/>
-      <w:pPr>
-        <w:ind w:left="1260" w:hanging="420"/>
-      </w:pPr>
-      <w:rPr>
-        <w:rFonts w:ascii="Wingdings" w:hAnsi="Wingdings"/>
-      </w:rPr>
-    </w:lvl>
-    <w:lvl w:ilvl="3" w:tentative="0">
-      <w:start w:val="1"/>
-      <w:numFmt w:val="bullet"/>
-      <w:lvlText w:val=""/>
-      <w:lvlJc w:val="left"/>
-      <w:pPr>
-        <w:ind w:left="1680" w:hanging="420"/>
-      </w:pPr>
-      <w:rPr>
-        <w:rFonts w:ascii="Wingdings" w:hAnsi="Wingdings"/>
-      </w:rPr>
-    </w:lvl>
-    <w:lvl w:ilvl="4" w:tentative="0">
-      <w:start w:val="1"/>
-      <w:numFmt w:val="bullet"/>
-      <w:lvlText w:val=""/>
-      <w:lvlJc w:val="left"/>
-      <w:pPr>
-        <w:ind w:left="2100" w:hanging="420"/>
-      </w:pPr>
-      <w:rPr>
-        <w:rFonts w:ascii="Wingdings" w:hAnsi="Wingdings"/>
-      </w:rPr>
-    </w:lvl>
-    <w:lvl w:ilvl="5" w:tentative="0">
-      <w:start w:val="1"/>
-      <w:numFmt w:val="bullet"/>
-      <w:lvlText w:val=""/>
-      <w:lvlJc w:val="left"/>
-      <w:pPr>
-        <w:ind w:left="2520" w:hanging="420"/>
-      </w:pPr>
-      <w:rPr>
-        <w:rFonts w:ascii="Wingdings" w:hAnsi="Wingdings"/>
-      </w:rPr>
-    </w:lvl>
-    <w:lvl w:ilvl="6" w:tentative="0">
-      <w:start w:val="1"/>
-      <w:numFmt w:val="bullet"/>
-      <w:lvlText w:val=""/>
-      <w:lvlJc w:val="left"/>
-      <w:pPr>
-        <w:ind w:left="2940" w:hanging="420"/>
-      </w:pPr>
-      <w:rPr>
-        <w:rFonts w:ascii="Wingdings" w:hAnsi="Wingdings"/>
-      </w:rPr>
-    </w:lvl>
-    <w:lvl w:ilvl="7" w:tentative="0">
-      <w:start w:val="1"/>
-      <w:numFmt w:val="bullet"/>
-      <w:lvlText w:val=""/>
-      <w:lvlJc w:val="left"/>
-      <w:pPr>
-        <w:ind w:left="3360" w:hanging="420"/>
-      </w:pPr>
-      <w:rPr>
-        <w:rFonts w:ascii="Wingdings" w:hAnsi="Wingdings"/>
-      </w:rPr>
-    </w:lvl>
-    <w:lvl w:ilvl="8" w:tentative="0">
-      <w:start w:val="1"/>
-      <w:numFmt w:val="bullet"/>
-      <w:lvlText w:val=""/>
-      <w:lvlJc w:val="left"/>
-      <w:pPr>
-        <w:ind w:left="3780" w:hanging="420"/>
-      </w:pPr>
-      <w:rPr>
-        <w:rFonts w:ascii="Wingdings" w:hAnsi="Wingdings"/>
-      </w:rPr>
-    </w:lvl>
-  </w:abstractNum>
-  <w:abstractNum w:abstractNumId="6">
-    <w:nsid w:val="6CFBD138"/>
-    <w:multiLevelType w:val="multilevel"/>
-    <w:tmpl w:val="6CFBD138"/>
-    <w:lvl w:ilvl="0" w:tentative="0">
-      <w:start w:val="1"/>
-      <w:numFmt w:val="decimal"/>
-      <w:lvlText w:val="%1."/>
-      <w:lvlJc w:val="left"/>
-      <w:pPr>
-        <w:tabs>
-          <w:tab w:val="left" w:pos="720"/>
-        </w:tabs>
-        <w:ind w:left="720" w:hanging="360"/>
-      </w:pPr>
-      <w:rPr>
-        <w:sz w:val="24"/>
-        <w:szCs w:val="24"/>
-      </w:rPr>
-    </w:lvl>
-    <w:lvl w:ilvl="1" w:tentative="0">
-      <w:start w:val="1"/>
-      <w:numFmt w:val="decimal"/>
-      <w:lvlText w:val="%2."/>
-      <w:lvlJc w:val="left"/>
-      <w:pPr>
-        <w:tabs>
-          <w:tab w:val="left" w:pos="1440"/>
-        </w:tabs>
-        <w:ind w:left="1440" w:hanging="360"/>
-      </w:pPr>
-      <w:rPr>
-        <w:sz w:val="24"/>
-        <w:szCs w:val="24"/>
-      </w:rPr>
-    </w:lvl>
-    <w:lvl w:ilvl="2" w:tentative="0">
-      <w:start w:val="1"/>
-      <w:numFmt w:val="decimal"/>
-      <w:lvlText w:val="%3."/>
-      <w:lvlJc w:val="left"/>
-      <w:pPr>
-        <w:tabs>
-          <w:tab w:val="left" w:pos="2160"/>
-        </w:tabs>
-        <w:ind w:left="2160" w:hanging="360"/>
-      </w:pPr>
-      <w:rPr>
-        <w:sz w:val="24"/>
-        <w:szCs w:val="24"/>
-      </w:rPr>
-    </w:lvl>
-    <w:lvl w:ilvl="3" w:tentative="0">
-      <w:start w:val="1"/>
-      <w:numFmt w:val="decimal"/>
-      <w:lvlText w:val="%4."/>
-      <w:lvlJc w:val="left"/>
-      <w:pPr>
-        <w:tabs>
-          <w:tab w:val="left" w:pos="2517"/>
-        </w:tabs>
-        <w:ind w:left="2880" w:hanging="360"/>
-      </w:pPr>
-      <w:rPr>
-        <w:sz w:val="24"/>
-        <w:szCs w:val="24"/>
-      </w:rPr>
-    </w:lvl>
-    <w:lvl w:ilvl="4" w:tentative="0">
-      <w:start w:val="1"/>
-      <w:numFmt w:val="decimal"/>
-      <w:lvlText w:val="%5."/>
-      <w:lvlJc w:val="left"/>
-      <w:pPr>
-        <w:tabs>
-          <w:tab w:val="left" w:pos="3238"/>
-        </w:tabs>
-        <w:ind w:left="3600" w:hanging="360"/>
-      </w:pPr>
-      <w:rPr>
-        <w:sz w:val="24"/>
-        <w:szCs w:val="24"/>
-      </w:rPr>
-    </w:lvl>
-    <w:lvl w:ilvl="5" w:tentative="0">
-      <w:start w:val="1"/>
-      <w:numFmt w:val="decimal"/>
-      <w:lvlText w:val="%6."/>
-      <w:lvlJc w:val="left"/>
-      <w:pPr>
-        <w:tabs>
-          <w:tab w:val="left" w:pos="3958"/>
-        </w:tabs>
-        <w:ind w:left="4320" w:hanging="360"/>
-      </w:pPr>
-      <w:rPr>
-        <w:sz w:val="24"/>
-        <w:szCs w:val="24"/>
-      </w:rPr>
-    </w:lvl>
-    <w:lvl w:ilvl="6" w:tentative="0">
-      <w:start w:val="1"/>
-      <w:numFmt w:val="decimal"/>
-      <w:lvlText w:val="%7."/>
-      <w:lvlJc w:val="left"/>
-      <w:pPr>
-        <w:tabs>
-          <w:tab w:val="left" w:pos="4678"/>
-        </w:tabs>
-        <w:ind w:left="5040" w:hanging="360"/>
-      </w:pPr>
-      <w:rPr>
-        <w:sz w:val="24"/>
-        <w:szCs w:val="24"/>
-      </w:rPr>
-    </w:lvl>
-    <w:lvl w:ilvl="7" w:tentative="0">
-      <w:start w:val="1"/>
-      <w:numFmt w:val="decimal"/>
-      <w:lvlText w:val="%8."/>
-      <w:lvlJc w:val="left"/>
-      <w:pPr>
-        <w:tabs>
-          <w:tab w:val="left" w:pos="5398"/>
-        </w:tabs>
-        <w:ind w:left="5760" w:hanging="360"/>
-      </w:pPr>
-      <w:rPr>
-        <w:sz w:val="24"/>
-        <w:szCs w:val="24"/>
-      </w:rPr>
-    </w:lvl>
-    <w:lvl w:ilvl="8" w:tentative="0">
-      <w:start w:val="1"/>
-      <w:numFmt w:val="decimal"/>
-      <w:lvlText w:val="%9."/>
-      <w:lvlJc w:val="left"/>
-      <w:pPr>
-        <w:tabs>
-          <w:tab w:val="left" w:pos="6118"/>
-        </w:tabs>
-        <w:ind w:left="6480" w:hanging="360"/>
-      </w:pPr>
-      <w:rPr>
-        <w:sz w:val="24"/>
-        <w:szCs w:val="24"/>
-      </w:rPr>
-    </w:lvl>
-  </w:abstractNum>
   <w:num w:numId="1">
-    <w:abstractNumId w:val="5"/>
+    <w:abstractNumId w:val="3"/>
   </w:num>
   <w:num w:numId="2">
-    <w:abstractNumId w:val="3"/>
+    <w:abstractNumId w:val="2"/>
     <w:lvlOverride w:ilvl="0">
       <w:startOverride w:val="1"/>
     </w:lvlOverride>
   </w:num>
   <w:num w:numId="3">
-    <w:abstractNumId w:val="3"/>
+    <w:abstractNumId w:val="2"/>
     <w:lvlOverride w:ilvl="0">
       <w:startOverride w:val="1"/>
     </w:lvlOverride>
   </w:num>
   <w:num w:numId="4">
-    <w:abstractNumId w:val="3"/>
+    <w:abstractNumId w:val="2"/>
     <w:lvlOverride w:ilvl="0">
       <w:startOverride w:val="2"/>
     </w:lvlOverride>
   </w:num>
   <w:num w:numId="5">
-    <w:abstractNumId w:val="3"/>
+    <w:abstractNumId w:val="2"/>
     <w:lvlOverride w:ilvl="0">
       <w:startOverride w:val="3"/>
     </w:lvlOverride>
   </w:num>
   <w:num w:numId="6">
-    <w:abstractNumId w:val="0"/>
+    <w:abstractNumId w:val="1"/>
   </w:num>
   <w:num w:numId="7">
     <w:abstractNumId w:val="4"/>
   </w:num>
   <w:num w:numId="8">
-    <w:abstractNumId w:val="2"/>
-  </w:num>
-  <w:num w:numId="9">
-    <w:abstractNumId w:val="6"/>
-  </w:num>
-  <w:num w:numId="10">
-    <w:abstractNumId w:val="1"/>
+    <w:abstractNumId w:val="0"/>
   </w:num>
 </w:numbering>
 </file>

</xml_diff>